<commit_message>
Added UML Diagram of web app with infographics
</commit_message>
<xml_diff>
--- a/Technnical Manual/TripMate Technical Manual.docx
+++ b/Technnical Manual/TripMate Technical Manual.docx
@@ -15,7 +15,6 @@
           <w:szCs w:val="48"/>
         </w:rPr>
       </w:pPr>
-      <w:proofErr w:type="spellStart"/>
       <w:r>
         <w:rPr>
           <w:rFonts w:ascii="Times New Roman" w:eastAsia="Times New Roman" w:hAnsi="Times New Roman" w:cs="Times New Roman"/>
@@ -25,19 +24,7 @@
           <w:sz w:val="48"/>
           <w:szCs w:val="48"/>
         </w:rPr>
-        <w:t>TripMate</w:t>
-      </w:r>
-      <w:proofErr w:type="spellEnd"/>
-      <w:r>
-        <w:rPr>
-          <w:rFonts w:ascii="Times New Roman" w:eastAsia="Times New Roman" w:hAnsi="Times New Roman" w:cs="Times New Roman"/>
-          <w:b/>
-          <w:bCs/>
-          <w:kern w:val="36"/>
-          <w:sz w:val="48"/>
-          <w:szCs w:val="48"/>
-        </w:rPr>
-        <w:t xml:space="preserve"> Technical Manual</w:t>
+        <w:t>TripMate Technical Manual</w:t>
       </w:r>
     </w:p>
     <w:p>
@@ -96,53 +83,25 @@
           <w:sz w:val="24"/>
           <w:szCs w:val="24"/>
         </w:rPr>
-        <w:t xml:space="preserve">This technical manual explains how to set up, execute and access the </w:t>
-      </w:r>
-      <w:proofErr w:type="spellStart"/>
-      <w:r>
-        <w:rPr>
-          <w:rFonts w:ascii="Times New Roman" w:eastAsia="Times New Roman" w:hAnsi="Times New Roman" w:cs="Times New Roman"/>
-          <w:sz w:val="24"/>
-          <w:szCs w:val="24"/>
-        </w:rPr>
-        <w:t>TripMate</w:t>
-      </w:r>
-      <w:proofErr w:type="spellEnd"/>
-      <w:r>
-        <w:rPr>
-          <w:rFonts w:ascii="Times New Roman" w:eastAsia="Times New Roman" w:hAnsi="Times New Roman" w:cs="Times New Roman"/>
-          <w:sz w:val="24"/>
-          <w:szCs w:val="24"/>
-        </w:rPr>
-        <w:t xml:space="preserve"> Travel Planning Web Application on a Windows computer. It is intended for a new developer, tester or team member who needs to run the application locally.</w:t>
-      </w:r>
-    </w:p>
-    <w:p>
-      <w:pPr>
-        <w:spacing w:before="100" w:beforeAutospacing="1" w:after="100" w:afterAutospacing="1" w:line="240" w:lineRule="auto"/>
-        <w:rPr>
-          <w:rFonts w:ascii="Times New Roman" w:eastAsia="Times New Roman" w:hAnsi="Times New Roman" w:cs="Times New Roman"/>
-          <w:sz w:val="24"/>
-          <w:szCs w:val="24"/>
-        </w:rPr>
-      </w:pPr>
-      <w:proofErr w:type="spellStart"/>
-      <w:r>
-        <w:rPr>
-          <w:rFonts w:ascii="Times New Roman" w:eastAsia="Times New Roman" w:hAnsi="Times New Roman" w:cs="Times New Roman"/>
-          <w:sz w:val="24"/>
-          <w:szCs w:val="24"/>
-        </w:rPr>
-        <w:t>TripMate</w:t>
-      </w:r>
-      <w:proofErr w:type="spellEnd"/>
-      <w:r>
-        <w:rPr>
-          <w:rFonts w:ascii="Times New Roman" w:eastAsia="Times New Roman" w:hAnsi="Times New Roman" w:cs="Times New Roman"/>
-          <w:sz w:val="24"/>
-          <w:szCs w:val="24"/>
-        </w:rPr>
-        <w:t xml:space="preserve"> is a travel planning application that helps users explore destinations and plan trips according to their preferences and budget.</w:t>
+        <w:t>This technical manual explains how to set up, execute and access the TripMate Travel Planning Web Application on a Windows computer. It is intended for a new developer, tester or team member who needs to run the application locally.</w:t>
+      </w:r>
+    </w:p>
+    <w:p>
+      <w:pPr>
+        <w:spacing w:before="100" w:beforeAutospacing="1" w:after="100" w:afterAutospacing="1" w:line="240" w:lineRule="auto"/>
+        <w:rPr>
+          <w:rFonts w:ascii="Times New Roman" w:eastAsia="Times New Roman" w:hAnsi="Times New Roman" w:cs="Times New Roman"/>
+          <w:sz w:val="24"/>
+          <w:szCs w:val="24"/>
+        </w:rPr>
+      </w:pPr>
+      <w:r>
+        <w:rPr>
+          <w:rFonts w:ascii="Times New Roman" w:eastAsia="Times New Roman" w:hAnsi="Times New Roman" w:cs="Times New Roman"/>
+          <w:sz w:val="24"/>
+          <w:szCs w:val="24"/>
+        </w:rPr>
+        <w:t>TripMate is a travel planning application that helps users explore destinations and plan trips according to their preferences and budget.</w:t>
       </w:r>
     </w:p>
     <w:p>
@@ -1028,19 +987,7 @@
           <w:sz w:val="27"/>
           <w:szCs w:val="27"/>
         </w:rPr>
-        <w:t>.1</w:t>
-      </w:r>
-      <w:bookmarkStart w:id="0" w:name="_GoBack"/>
-      <w:bookmarkEnd w:id="0"/>
-      <w:r>
-        <w:rPr>
-          <w:rFonts w:ascii="Times New Roman" w:eastAsia="Times New Roman" w:hAnsi="Times New Roman" w:cs="Times New Roman"/>
-          <w:b/>
-          <w:bCs/>
-          <w:sz w:val="27"/>
-          <w:szCs w:val="27"/>
-        </w:rPr>
-        <w:t xml:space="preserve"> Install Visual Studio Code</w:t>
+        <w:t>.1 Install Visual Studio Code</w:t>
       </w:r>
     </w:p>
     <w:p>
@@ -1126,25 +1073,7 @@
           <w:sz w:val="24"/>
           <w:szCs w:val="24"/>
         </w:rPr>
-        <w:t xml:space="preserve">Step 3: Run the installer and accept the </w:t>
-      </w:r>
-      <w:proofErr w:type="spellStart"/>
-      <w:r>
-        <w:rPr>
-          <w:rFonts w:ascii="Times New Roman" w:eastAsia="Times New Roman" w:hAnsi="Times New Roman" w:cs="Times New Roman"/>
-          <w:sz w:val="24"/>
-          <w:szCs w:val="24"/>
-        </w:rPr>
-        <w:t>licence</w:t>
-      </w:r>
-      <w:proofErr w:type="spellEnd"/>
-      <w:r>
-        <w:rPr>
-          <w:rFonts w:ascii="Times New Roman" w:eastAsia="Times New Roman" w:hAnsi="Times New Roman" w:cs="Times New Roman"/>
-          <w:sz w:val="24"/>
-          <w:szCs w:val="24"/>
-        </w:rPr>
-        <w:t xml:space="preserve"> agreement.</w:t>
+        <w:t>Step 3: Run the installer and accept the licence agreement.</w:t>
       </w:r>
     </w:p>
     <w:p>
@@ -1180,25 +1109,7 @@
           <w:sz w:val="24"/>
           <w:szCs w:val="24"/>
         </w:rPr>
-        <w:t xml:space="preserve">VS Code will be used to open the </w:t>
-      </w:r>
-      <w:proofErr w:type="spellStart"/>
-      <w:r>
-        <w:rPr>
-          <w:rFonts w:ascii="Times New Roman" w:eastAsia="Times New Roman" w:hAnsi="Times New Roman" w:cs="Times New Roman"/>
-          <w:sz w:val="24"/>
-          <w:szCs w:val="24"/>
-        </w:rPr>
-        <w:t>TripMate</w:t>
-      </w:r>
-      <w:proofErr w:type="spellEnd"/>
-      <w:r>
-        <w:rPr>
-          <w:rFonts w:ascii="Times New Roman" w:eastAsia="Times New Roman" w:hAnsi="Times New Roman" w:cs="Times New Roman"/>
-          <w:sz w:val="24"/>
-          <w:szCs w:val="24"/>
-        </w:rPr>
-        <w:t xml:space="preserve"> source code, run terminal commands and inspect project files.</w:t>
+        <w:t>VS Code will be used to open the TripMate source code, run terminal commands and inspect project files.</w:t>
       </w:r>
     </w:p>
     <w:p>
@@ -1427,7 +1338,6 @@
           <w:szCs w:val="20"/>
         </w:rPr>
       </w:pPr>
-      <w:proofErr w:type="spellStart"/>
       <w:r>
         <w:rPr>
           <w:rFonts w:ascii="Courier New" w:eastAsia="Times New Roman" w:hAnsi="Courier New" w:cs="Courier New"/>
@@ -1435,16 +1345,7 @@
           <w:szCs w:val="20"/>
         </w:rPr>
         <w:lastRenderedPageBreak/>
-        <w:t>git</w:t>
-      </w:r>
-      <w:proofErr w:type="spellEnd"/>
-      <w:r>
-        <w:rPr>
-          <w:rFonts w:ascii="Courier New" w:eastAsia="Times New Roman" w:hAnsi="Courier New" w:cs="Courier New"/>
-          <w:sz w:val="20"/>
-          <w:szCs w:val="20"/>
-        </w:rPr>
-        <w:t xml:space="preserve"> --version</w:t>
+        <w:t>git --version</w:t>
       </w:r>
     </w:p>
     <w:p>
@@ -1485,55 +1386,25 @@
           <w:sz w:val="27"/>
           <w:szCs w:val="27"/>
         </w:rPr>
-        <w:t xml:space="preserve">3.3 Install Node.js and </w:t>
-      </w:r>
-      <w:proofErr w:type="spellStart"/>
-      <w:r>
-        <w:rPr>
-          <w:rFonts w:ascii="Times New Roman" w:eastAsia="Times New Roman" w:hAnsi="Times New Roman" w:cs="Times New Roman"/>
-          <w:b/>
-          <w:bCs/>
-          <w:sz w:val="27"/>
-          <w:szCs w:val="27"/>
-        </w:rPr>
-        <w:t>npm</w:t>
-      </w:r>
-      <w:proofErr w:type="spellEnd"/>
-    </w:p>
-    <w:p>
-      <w:pPr>
-        <w:spacing w:before="100" w:beforeAutospacing="1" w:after="100" w:afterAutospacing="1" w:line="240" w:lineRule="auto"/>
-        <w:rPr>
-          <w:rFonts w:ascii="Times New Roman" w:eastAsia="Times New Roman" w:hAnsi="Times New Roman" w:cs="Times New Roman"/>
-          <w:sz w:val="24"/>
-          <w:szCs w:val="24"/>
-        </w:rPr>
-      </w:pPr>
-      <w:r>
-        <w:rPr>
-          <w:rFonts w:ascii="Times New Roman" w:eastAsia="Times New Roman" w:hAnsi="Times New Roman" w:cs="Times New Roman"/>
-          <w:sz w:val="24"/>
-          <w:szCs w:val="24"/>
-        </w:rPr>
-        <w:t xml:space="preserve">Node.js is required to run the React frontend and </w:t>
-      </w:r>
-      <w:proofErr w:type="spellStart"/>
-      <w:r>
-        <w:rPr>
-          <w:rFonts w:ascii="Times New Roman" w:eastAsia="Times New Roman" w:hAnsi="Times New Roman" w:cs="Times New Roman"/>
-          <w:sz w:val="24"/>
-          <w:szCs w:val="24"/>
-        </w:rPr>
-        <w:t>npm</w:t>
-      </w:r>
-      <w:proofErr w:type="spellEnd"/>
-      <w:r>
-        <w:rPr>
-          <w:rFonts w:ascii="Times New Roman" w:eastAsia="Times New Roman" w:hAnsi="Times New Roman" w:cs="Times New Roman"/>
-          <w:sz w:val="24"/>
-          <w:szCs w:val="24"/>
-        </w:rPr>
-        <w:t xml:space="preserve"> is used to install JavaScript packages.</w:t>
+        <w:t>3.3 Install Node.js and npm</w:t>
+      </w:r>
+    </w:p>
+    <w:p>
+      <w:pPr>
+        <w:spacing w:before="100" w:beforeAutospacing="1" w:after="100" w:afterAutospacing="1" w:line="240" w:lineRule="auto"/>
+        <w:rPr>
+          <w:rFonts w:ascii="Times New Roman" w:eastAsia="Times New Roman" w:hAnsi="Times New Roman" w:cs="Times New Roman"/>
+          <w:sz w:val="24"/>
+          <w:szCs w:val="24"/>
+        </w:rPr>
+      </w:pPr>
+      <w:r>
+        <w:rPr>
+          <w:rFonts w:ascii="Times New Roman" w:eastAsia="Times New Roman" w:hAnsi="Times New Roman" w:cs="Times New Roman"/>
+          <w:sz w:val="24"/>
+          <w:szCs w:val="24"/>
+        </w:rPr>
+        <w:t>Node.js is required to run the React frontend and npm is used to install JavaScript packages.</w:t>
       </w:r>
     </w:p>
     <w:p>
@@ -1655,25 +1526,7 @@
           <w:sz w:val="24"/>
           <w:szCs w:val="24"/>
         </w:rPr>
-        <w:t xml:space="preserve">Step 2: Download the LTS version unless the </w:t>
-      </w:r>
-      <w:proofErr w:type="spellStart"/>
-      <w:r>
-        <w:rPr>
-          <w:rFonts w:ascii="Times New Roman" w:eastAsia="Times New Roman" w:hAnsi="Times New Roman" w:cs="Times New Roman"/>
-          <w:sz w:val="24"/>
-          <w:szCs w:val="24"/>
-        </w:rPr>
-        <w:t>TripMate</w:t>
-      </w:r>
-      <w:proofErr w:type="spellEnd"/>
-      <w:r>
-        <w:rPr>
-          <w:rFonts w:ascii="Times New Roman" w:eastAsia="Times New Roman" w:hAnsi="Times New Roman" w:cs="Times New Roman"/>
-          <w:sz w:val="24"/>
-          <w:szCs w:val="24"/>
-        </w:rPr>
-        <w:t xml:space="preserve"> project specifies another version.</w:t>
+        <w:t>Step 2: Download the LTS version unless the TripMate project specifies another version.</w:t>
       </w:r>
     </w:p>
     <w:p>
@@ -1793,50 +1646,47 @@
           <w:szCs w:val="20"/>
         </w:rPr>
       </w:pPr>
-      <w:proofErr w:type="spellStart"/>
       <w:r>
         <w:rPr>
           <w:rFonts w:ascii="Courier New" w:eastAsia="Times New Roman" w:hAnsi="Courier New" w:cs="Courier New"/>
           <w:sz w:val="20"/>
           <w:szCs w:val="20"/>
         </w:rPr>
-        <w:t>npm</w:t>
-      </w:r>
-      <w:proofErr w:type="spellEnd"/>
+        <w:t>npm --version</w:t>
+      </w:r>
+    </w:p>
+    <w:p>
+      <w:pPr>
+        <w:spacing w:before="100" w:beforeAutospacing="1" w:after="100" w:afterAutospacing="1" w:line="240" w:lineRule="auto"/>
+        <w:rPr>
+          <w:rFonts w:ascii="Times New Roman" w:eastAsia="Times New Roman" w:hAnsi="Times New Roman" w:cs="Times New Roman"/>
+          <w:sz w:val="24"/>
+          <w:szCs w:val="24"/>
+        </w:rPr>
+      </w:pPr>
+      <w:r>
+        <w:rPr>
+          <w:rFonts w:ascii="Times New Roman" w:eastAsia="Times New Roman" w:hAnsi="Times New Roman" w:cs="Times New Roman"/>
+          <w:sz w:val="24"/>
+          <w:szCs w:val="24"/>
+        </w:rPr>
+        <w:t xml:space="preserve">Both commands should display version numbers. If the project contains a </w:t>
+      </w:r>
       <w:r>
         <w:rPr>
           <w:rFonts w:ascii="Courier New" w:eastAsia="Times New Roman" w:hAnsi="Courier New" w:cs="Courier New"/>
           <w:sz w:val="20"/>
           <w:szCs w:val="20"/>
         </w:rPr>
-        <w:t xml:space="preserve"> --version</w:t>
-      </w:r>
-    </w:p>
-    <w:p>
-      <w:pPr>
-        <w:spacing w:before="100" w:beforeAutospacing="1" w:after="100" w:afterAutospacing="1" w:line="240" w:lineRule="auto"/>
-        <w:rPr>
-          <w:rFonts w:ascii="Times New Roman" w:eastAsia="Times New Roman" w:hAnsi="Times New Roman" w:cs="Times New Roman"/>
-          <w:sz w:val="24"/>
-          <w:szCs w:val="24"/>
-        </w:rPr>
-      </w:pPr>
-      <w:r>
-        <w:rPr>
-          <w:rFonts w:ascii="Times New Roman" w:eastAsia="Times New Roman" w:hAnsi="Times New Roman" w:cs="Times New Roman"/>
-          <w:sz w:val="24"/>
-          <w:szCs w:val="24"/>
-        </w:rPr>
-        <w:t xml:space="preserve">Both commands should display version numbers. If the project contains </w:t>
-      </w:r>
-      <w:proofErr w:type="gramStart"/>
-      <w:r>
-        <w:rPr>
-          <w:rFonts w:ascii="Times New Roman" w:eastAsia="Times New Roman" w:hAnsi="Times New Roman" w:cs="Times New Roman"/>
-          <w:sz w:val="24"/>
-          <w:szCs w:val="24"/>
-        </w:rPr>
-        <w:t xml:space="preserve">a </w:t>
+        <w:t>.nvmrc</w:t>
+      </w:r>
+      <w:r>
+        <w:rPr>
+          <w:rFonts w:ascii="Times New Roman" w:eastAsia="Times New Roman" w:hAnsi="Times New Roman" w:cs="Times New Roman"/>
+          <w:sz w:val="24"/>
+          <w:szCs w:val="24"/>
+        </w:rPr>
+        <w:t xml:space="preserve"> file or specifies a Node version in </w:t>
       </w:r>
       <w:r>
         <w:rPr>
@@ -1844,37 +1694,8 @@
           <w:sz w:val="20"/>
           <w:szCs w:val="20"/>
         </w:rPr>
-        <w:t>.</w:t>
-      </w:r>
-      <w:proofErr w:type="spellStart"/>
-      <w:r>
-        <w:rPr>
-          <w:rFonts w:ascii="Courier New" w:eastAsia="Times New Roman" w:hAnsi="Courier New" w:cs="Courier New"/>
-          <w:sz w:val="20"/>
-          <w:szCs w:val="20"/>
-        </w:rPr>
-        <w:t>nvmrc</w:t>
-      </w:r>
-      <w:proofErr w:type="spellEnd"/>
-      <w:proofErr w:type="gramEnd"/>
-      <w:r>
-        <w:rPr>
-          <w:rFonts w:ascii="Times New Roman" w:eastAsia="Times New Roman" w:hAnsi="Times New Roman" w:cs="Times New Roman"/>
-          <w:sz w:val="24"/>
-          <w:szCs w:val="24"/>
-        </w:rPr>
-        <w:t xml:space="preserve"> file or specifies a Node version in </w:t>
-      </w:r>
-      <w:proofErr w:type="spellStart"/>
-      <w:r>
-        <w:rPr>
-          <w:rFonts w:ascii="Courier New" w:eastAsia="Times New Roman" w:hAnsi="Courier New" w:cs="Courier New"/>
-          <w:sz w:val="20"/>
-          <w:szCs w:val="20"/>
-        </w:rPr>
         <w:t>package.json</w:t>
       </w:r>
-      <w:proofErr w:type="spellEnd"/>
       <w:r>
         <w:rPr>
           <w:rFonts w:ascii="Times New Roman" w:eastAsia="Times New Roman" w:hAnsi="Times New Roman" w:cs="Times New Roman"/>
@@ -1922,25 +1743,7 @@
           <w:sz w:val="24"/>
           <w:szCs w:val="24"/>
         </w:rPr>
-        <w:t xml:space="preserve">The .NET SDK is required to build and run the </w:t>
-      </w:r>
-      <w:proofErr w:type="spellStart"/>
-      <w:r>
-        <w:rPr>
-          <w:rFonts w:ascii="Times New Roman" w:eastAsia="Times New Roman" w:hAnsi="Times New Roman" w:cs="Times New Roman"/>
-          <w:sz w:val="24"/>
-          <w:szCs w:val="24"/>
-        </w:rPr>
-        <w:t>TripMate</w:t>
-      </w:r>
-      <w:proofErr w:type="spellEnd"/>
-      <w:r>
-        <w:rPr>
-          <w:rFonts w:ascii="Times New Roman" w:eastAsia="Times New Roman" w:hAnsi="Times New Roman" w:cs="Times New Roman"/>
-          <w:sz w:val="24"/>
-          <w:szCs w:val="24"/>
-        </w:rPr>
-        <w:t xml:space="preserve"> backend.</w:t>
+        <w:t>The .NET SDK is required to build and run the TripMate backend.</w:t>
       </w:r>
     </w:p>
     <w:p>
@@ -2062,25 +1865,7 @@
           <w:sz w:val="24"/>
           <w:szCs w:val="24"/>
         </w:rPr>
-        <w:t xml:space="preserve">Step 2: Download the SDK compatible with the </w:t>
-      </w:r>
-      <w:proofErr w:type="spellStart"/>
-      <w:r>
-        <w:rPr>
-          <w:rFonts w:ascii="Times New Roman" w:eastAsia="Times New Roman" w:hAnsi="Times New Roman" w:cs="Times New Roman"/>
-          <w:sz w:val="24"/>
-          <w:szCs w:val="24"/>
-        </w:rPr>
-        <w:t>backend's</w:t>
-      </w:r>
-      <w:proofErr w:type="spellEnd"/>
-      <w:r>
-        <w:rPr>
-          <w:rFonts w:ascii="Times New Roman" w:eastAsia="Times New Roman" w:hAnsi="Times New Roman" w:cs="Times New Roman"/>
-          <w:sz w:val="24"/>
-          <w:szCs w:val="24"/>
-        </w:rPr>
-        <w:t xml:space="preserve"> target framework.</w:t>
+        <w:t>Step 2: Download the SDK compatible with the backend's target framework.</w:t>
       </w:r>
     </w:p>
     <w:p>
@@ -2147,60 +1932,40 @@
           <w:szCs w:val="20"/>
         </w:rPr>
       </w:pPr>
-      <w:proofErr w:type="spellStart"/>
       <w:r>
         <w:rPr>
           <w:rFonts w:ascii="Courier New" w:eastAsia="Times New Roman" w:hAnsi="Courier New" w:cs="Courier New"/>
           <w:sz w:val="20"/>
           <w:szCs w:val="20"/>
         </w:rPr>
-        <w:t>dotnet</w:t>
-      </w:r>
-      <w:proofErr w:type="spellEnd"/>
+        <w:t>dotnet --info</w:t>
+      </w:r>
+    </w:p>
+    <w:p>
+      <w:pPr>
+        <w:spacing w:before="100" w:beforeAutospacing="1" w:after="100" w:afterAutospacing="1" w:line="240" w:lineRule="auto"/>
+        <w:rPr>
+          <w:rFonts w:ascii="Times New Roman" w:eastAsia="Times New Roman" w:hAnsi="Times New Roman" w:cs="Times New Roman"/>
+          <w:sz w:val="24"/>
+          <w:szCs w:val="24"/>
+        </w:rPr>
+      </w:pPr>
+      <w:r>
+        <w:rPr>
+          <w:rFonts w:ascii="Times New Roman" w:eastAsia="Times New Roman" w:hAnsi="Times New Roman" w:cs="Times New Roman"/>
+          <w:sz w:val="24"/>
+          <w:szCs w:val="24"/>
+        </w:rPr>
+        <w:t xml:space="preserve">The output should display the installed SDK and runtime details. The required version can be identified in the backend </w:t>
+      </w:r>
       <w:r>
         <w:rPr>
           <w:rFonts w:ascii="Courier New" w:eastAsia="Times New Roman" w:hAnsi="Courier New" w:cs="Courier New"/>
           <w:sz w:val="20"/>
           <w:szCs w:val="20"/>
         </w:rPr>
-        <w:t xml:space="preserve"> --info</w:t>
-      </w:r>
-    </w:p>
-    <w:p>
-      <w:pPr>
-        <w:spacing w:before="100" w:beforeAutospacing="1" w:after="100" w:afterAutospacing="1" w:line="240" w:lineRule="auto"/>
-        <w:rPr>
-          <w:rFonts w:ascii="Times New Roman" w:eastAsia="Times New Roman" w:hAnsi="Times New Roman" w:cs="Times New Roman"/>
-          <w:sz w:val="24"/>
-          <w:szCs w:val="24"/>
-        </w:rPr>
-      </w:pPr>
-      <w:r>
-        <w:rPr>
-          <w:rFonts w:ascii="Times New Roman" w:eastAsia="Times New Roman" w:hAnsi="Times New Roman" w:cs="Times New Roman"/>
-          <w:sz w:val="24"/>
-          <w:szCs w:val="24"/>
-        </w:rPr>
-        <w:t xml:space="preserve">The output should display the installed SDK and runtime details. The required version can be identified in the backend </w:t>
-      </w:r>
-      <w:r>
-        <w:rPr>
-          <w:rFonts w:ascii="Courier New" w:eastAsia="Times New Roman" w:hAnsi="Courier New" w:cs="Courier New"/>
-          <w:sz w:val="20"/>
-          <w:szCs w:val="20"/>
-        </w:rPr>
-        <w:t>.</w:t>
-      </w:r>
-      <w:proofErr w:type="spellStart"/>
-      <w:r>
-        <w:rPr>
-          <w:rFonts w:ascii="Courier New" w:eastAsia="Times New Roman" w:hAnsi="Courier New" w:cs="Courier New"/>
-          <w:sz w:val="20"/>
-          <w:szCs w:val="20"/>
-        </w:rPr>
-        <w:t>csproj</w:t>
-      </w:r>
-      <w:proofErr w:type="spellEnd"/>
+        <w:t>.csproj</w:t>
+      </w:r>
       <w:r>
         <w:rPr>
           <w:rFonts w:ascii="Times New Roman" w:eastAsia="Times New Roman" w:hAnsi="Times New Roman" w:cs="Times New Roman"/>
@@ -2424,25 +2189,7 @@
           <w:sz w:val="24"/>
           <w:szCs w:val="24"/>
         </w:rPr>
-        <w:t xml:space="preserve">Step 5: Ensure the MySQL service is running before starting </w:t>
-      </w:r>
-      <w:proofErr w:type="spellStart"/>
-      <w:r>
-        <w:rPr>
-          <w:rFonts w:ascii="Times New Roman" w:eastAsia="Times New Roman" w:hAnsi="Times New Roman" w:cs="Times New Roman"/>
-          <w:sz w:val="24"/>
-          <w:szCs w:val="24"/>
-        </w:rPr>
-        <w:t>TripMate</w:t>
-      </w:r>
-      <w:proofErr w:type="spellEnd"/>
-      <w:r>
-        <w:rPr>
-          <w:rFonts w:ascii="Times New Roman" w:eastAsia="Times New Roman" w:hAnsi="Times New Roman" w:cs="Times New Roman"/>
-          <w:sz w:val="24"/>
-          <w:szCs w:val="24"/>
-        </w:rPr>
-        <w:t>.</w:t>
+        <w:t>Step 5: Ensure the MySQL service is running before starting TripMate.</w:t>
       </w:r>
     </w:p>
     <w:p>
@@ -2659,7 +2406,6 @@
                 <w:szCs w:val="24"/>
               </w:rPr>
             </w:pPr>
-            <w:proofErr w:type="spellStart"/>
             <w:r>
               <w:rPr>
                 <w:rFonts w:ascii="Times New Roman" w:eastAsia="Times New Roman" w:hAnsi="Times New Roman" w:cs="Times New Roman"/>
@@ -2668,7 +2414,6 @@
               </w:rPr>
               <w:t>ESLint</w:t>
             </w:r>
-            <w:proofErr w:type="spellEnd"/>
           </w:p>
         </w:tc>
         <w:tc>
@@ -2771,23 +2516,13 @@
                 <w:szCs w:val="24"/>
               </w:rPr>
             </w:pPr>
-            <w:proofErr w:type="spellStart"/>
             <w:r>
               <w:rPr>
                 <w:rFonts w:ascii="Times New Roman" w:eastAsia="Times New Roman" w:hAnsi="Times New Roman" w:cs="Times New Roman"/>
                 <w:sz w:val="24"/>
                 <w:szCs w:val="24"/>
               </w:rPr>
-              <w:t>SQLTools</w:t>
-            </w:r>
-            <w:proofErr w:type="spellEnd"/>
-            <w:r>
-              <w:rPr>
-                <w:rFonts w:ascii="Times New Roman" w:eastAsia="Times New Roman" w:hAnsi="Times New Roman" w:cs="Times New Roman"/>
-                <w:sz w:val="24"/>
-                <w:szCs w:val="24"/>
-              </w:rPr>
-              <w:t xml:space="preserve"> or a MySQL extension</w:t>
+              <w:t>SQLTools or a MySQL extension</w:t>
             </w:r>
           </w:p>
         </w:tc>
@@ -2856,29 +2591,7 @@
           <w:sz w:val="36"/>
           <w:szCs w:val="36"/>
         </w:rPr>
-        <w:t xml:space="preserve">5. Downloading the </w:t>
-      </w:r>
-      <w:proofErr w:type="spellStart"/>
-      <w:r>
-        <w:rPr>
-          <w:rFonts w:ascii="Times New Roman" w:eastAsia="Times New Roman" w:hAnsi="Times New Roman" w:cs="Times New Roman"/>
-          <w:b/>
-          <w:bCs/>
-          <w:sz w:val="36"/>
-          <w:szCs w:val="36"/>
-        </w:rPr>
-        <w:t>TripMate</w:t>
-      </w:r>
-      <w:proofErr w:type="spellEnd"/>
-      <w:r>
-        <w:rPr>
-          <w:rFonts w:ascii="Times New Roman" w:eastAsia="Times New Roman" w:hAnsi="Times New Roman" w:cs="Times New Roman"/>
-          <w:b/>
-          <w:bCs/>
-          <w:sz w:val="36"/>
-          <w:szCs w:val="36"/>
-        </w:rPr>
-        <w:t xml:space="preserve"> source code</w:t>
+        <w:t>5. Downloading the TripMate source code</w:t>
       </w:r>
     </w:p>
     <w:p>
@@ -3058,23 +2771,13 @@
           <w:szCs w:val="20"/>
         </w:rPr>
       </w:pPr>
-      <w:proofErr w:type="spellStart"/>
       <w:r>
         <w:rPr>
           <w:rFonts w:ascii="Courier New" w:eastAsia="Times New Roman" w:hAnsi="Courier New" w:cs="Courier New"/>
           <w:sz w:val="20"/>
           <w:szCs w:val="20"/>
         </w:rPr>
-        <w:t>git</w:t>
-      </w:r>
-      <w:proofErr w:type="spellEnd"/>
-      <w:r>
-        <w:rPr>
-          <w:rFonts w:ascii="Courier New" w:eastAsia="Times New Roman" w:hAnsi="Courier New" w:cs="Courier New"/>
-          <w:sz w:val="20"/>
-          <w:szCs w:val="20"/>
-        </w:rPr>
-        <w:t xml:space="preserve"> clone https://github.com/0Nikesh/S226-PRT681-PRT585-SOFTWARE-ENGINEERING-PRACTICE-Group2.git</w:t>
+        <w:t>git clone https://github.com/0Nikesh/S226-PRT681-PRT585-SOFTWARE-ENGINEERING-PRACTICE-Group2.git</w:t>
       </w:r>
     </w:p>
     <w:p>
@@ -3158,7 +2861,6 @@
           <w:szCs w:val="20"/>
         </w:rPr>
       </w:pPr>
-      <w:proofErr w:type="gramStart"/>
       <w:r>
         <w:rPr>
           <w:rFonts w:ascii="Courier New" w:eastAsia="Times New Roman" w:hAnsi="Courier New" w:cs="Courier New"/>
@@ -3167,7 +2869,6 @@
         </w:rPr>
         <w:t>code .</w:t>
       </w:r>
-      <w:proofErr w:type="gramEnd"/>
     </w:p>
     <w:p>
       <w:pPr>
@@ -3186,7 +2887,6 @@
         </w:rPr>
         <w:t xml:space="preserve">If </w:t>
       </w:r>
-      <w:proofErr w:type="gramStart"/>
       <w:r>
         <w:rPr>
           <w:rFonts w:ascii="Courier New" w:eastAsia="Times New Roman" w:hAnsi="Courier New" w:cs="Courier New"/>
@@ -3195,7 +2895,6 @@
         </w:rPr>
         <w:t>code .</w:t>
       </w:r>
-      <w:proofErr w:type="gramEnd"/>
       <w:r>
         <w:rPr>
           <w:rFonts w:ascii="Times New Roman" w:eastAsia="Times New Roman" w:hAnsi="Times New Roman" w:cs="Times New Roman"/>
@@ -3250,7 +2949,6 @@
         <w:t xml:space="preserve">Open the </w:t>
       </w:r>
       <w:hyperlink r:id="rId19" w:history="1">
-        <w:proofErr w:type="spellStart"/>
         <w:r>
           <w:rPr>
             <w:rFonts w:ascii="Times New Roman" w:eastAsia="Times New Roman" w:hAnsi="Times New Roman" w:cs="Times New Roman"/>
@@ -3259,18 +2957,7 @@
             <w:szCs w:val="24"/>
             <w:u w:val="single"/>
           </w:rPr>
-          <w:t>TripMate</w:t>
-        </w:r>
-        <w:proofErr w:type="spellEnd"/>
-        <w:r>
-          <w:rPr>
-            <w:rFonts w:ascii="Times New Roman" w:eastAsia="Times New Roman" w:hAnsi="Times New Roman" w:cs="Times New Roman"/>
-            <w:color w:val="0000FF"/>
-            <w:sz w:val="24"/>
-            <w:szCs w:val="24"/>
-            <w:u w:val="single"/>
-          </w:rPr>
-          <w:t xml:space="preserve"> repository</w:t>
+          <w:t>TripMate repository</w:t>
         </w:r>
       </w:hyperlink>
       <w:r>
@@ -3478,23 +3165,13 @@
           <w:szCs w:val="24"/>
         </w:rPr>
       </w:pPr>
-      <w:proofErr w:type="spellStart"/>
-      <w:r>
-        <w:rPr>
-          <w:rFonts w:ascii="Times New Roman" w:eastAsia="Times New Roman" w:hAnsi="Times New Roman" w:cs="Times New Roman"/>
-          <w:sz w:val="24"/>
-          <w:szCs w:val="24"/>
-        </w:rPr>
-        <w:t>TripMate</w:t>
-      </w:r>
-      <w:proofErr w:type="spellEnd"/>
-      <w:r>
-        <w:rPr>
-          <w:rFonts w:ascii="Times New Roman" w:eastAsia="Times New Roman" w:hAnsi="Times New Roman" w:cs="Times New Roman"/>
-          <w:sz w:val="24"/>
-          <w:szCs w:val="24"/>
-        </w:rPr>
-        <w:t xml:space="preserve"> repository</w:t>
+      <w:r>
+        <w:rPr>
+          <w:rFonts w:ascii="Times New Roman" w:eastAsia="Times New Roman" w:hAnsi="Times New Roman" w:cs="Times New Roman"/>
+          <w:sz w:val="24"/>
+          <w:szCs w:val="24"/>
+        </w:rPr>
+        <w:t>TripMate repository</w:t>
       </w:r>
     </w:p>
     <w:p>
@@ -3533,8 +3210,6 @@
         <w:lastRenderedPageBreak/>
         <w:t xml:space="preserve">Contains </w:t>
       </w:r>
-      <w:proofErr w:type="spellStart"/>
-      <w:proofErr w:type="gramStart"/>
       <w:r>
         <w:rPr>
           <w:rFonts w:ascii="Courier New" w:eastAsia="Times New Roman" w:hAnsi="Courier New" w:cs="Courier New"/>
@@ -3543,8 +3218,6 @@
         </w:rPr>
         <w:t>package.json</w:t>
       </w:r>
-      <w:proofErr w:type="spellEnd"/>
-      <w:proofErr w:type="gramEnd"/>
       <w:r>
         <w:rPr>
           <w:rFonts w:ascii="Times New Roman" w:eastAsia="Times New Roman" w:hAnsi="Times New Roman" w:cs="Times New Roman"/>
@@ -3595,44 +3268,24 @@
           <w:sz w:val="20"/>
           <w:szCs w:val="20"/>
         </w:rPr>
-        <w:t>.</w:t>
-      </w:r>
-      <w:proofErr w:type="spellStart"/>
+        <w:t>.csproj</w:t>
+      </w:r>
+      <w:r>
+        <w:rPr>
+          <w:rFonts w:ascii="Times New Roman" w:eastAsia="Times New Roman" w:hAnsi="Times New Roman" w:cs="Times New Roman"/>
+          <w:sz w:val="24"/>
+          <w:szCs w:val="24"/>
+        </w:rPr>
+        <w:t xml:space="preserve"> or </w:t>
+      </w:r>
       <w:r>
         <w:rPr>
           <w:rFonts w:ascii="Courier New" w:eastAsia="Times New Roman" w:hAnsi="Courier New" w:cs="Courier New"/>
           <w:sz w:val="20"/>
           <w:szCs w:val="20"/>
         </w:rPr>
-        <w:t>csproj</w:t>
-      </w:r>
-      <w:proofErr w:type="spellEnd"/>
-      <w:r>
-        <w:rPr>
-          <w:rFonts w:ascii="Times New Roman" w:eastAsia="Times New Roman" w:hAnsi="Times New Roman" w:cs="Times New Roman"/>
-          <w:sz w:val="24"/>
-          <w:szCs w:val="24"/>
-        </w:rPr>
-        <w:t xml:space="preserve"> or </w:t>
-      </w:r>
-      <w:r>
-        <w:rPr>
-          <w:rFonts w:ascii="Courier New" w:eastAsia="Times New Roman" w:hAnsi="Courier New" w:cs="Courier New"/>
-          <w:sz w:val="20"/>
-          <w:szCs w:val="20"/>
-        </w:rPr>
-        <w:t>.</w:t>
-      </w:r>
-      <w:proofErr w:type="spellStart"/>
-      <w:r>
-        <w:rPr>
-          <w:rFonts w:ascii="Courier New" w:eastAsia="Times New Roman" w:hAnsi="Courier New" w:cs="Courier New"/>
-          <w:sz w:val="20"/>
-          <w:szCs w:val="20"/>
-        </w:rPr>
-        <w:t>sln</w:t>
-      </w:r>
-      <w:proofErr w:type="spellEnd"/>
+        <w:t>.sln</w:t>
+      </w:r>
       <w:r>
         <w:rPr>
           <w:rFonts w:ascii="Times New Roman" w:eastAsia="Times New Roman" w:hAnsi="Times New Roman" w:cs="Times New Roman"/>
@@ -3752,20 +3405,8 @@
           <w:sz w:val="27"/>
           <w:szCs w:val="27"/>
         </w:rPr>
-        <w:t xml:space="preserve">How to identify the correct </w:t>
-      </w:r>
-      <w:proofErr w:type="gramStart"/>
-      <w:r>
-        <w:rPr>
-          <w:rFonts w:ascii="Times New Roman" w:eastAsia="Times New Roman" w:hAnsi="Times New Roman" w:cs="Times New Roman"/>
-          <w:b/>
-          <w:bCs/>
-          <w:sz w:val="27"/>
-          <w:szCs w:val="27"/>
-        </w:rPr>
-        <w:t>folders</w:t>
-      </w:r>
-      <w:proofErr w:type="gramEnd"/>
+        <w:t>How to identify the correct folders</w:t>
+      </w:r>
     </w:p>
     <w:p>
       <w:pPr>
@@ -3788,8 +3429,6 @@
         </w:rPr>
         <w:t xml:space="preserve">Open </w:t>
       </w:r>
-      <w:proofErr w:type="spellStart"/>
-      <w:proofErr w:type="gramStart"/>
       <w:r>
         <w:rPr>
           <w:rFonts w:ascii="Courier New" w:eastAsia="Times New Roman" w:hAnsi="Courier New" w:cs="Courier New"/>
@@ -3798,8 +3437,6 @@
         </w:rPr>
         <w:t>package.json</w:t>
       </w:r>
-      <w:proofErr w:type="spellEnd"/>
-      <w:proofErr w:type="gramEnd"/>
       <w:r>
         <w:rPr>
           <w:rFonts w:ascii="Times New Roman" w:eastAsia="Times New Roman" w:hAnsi="Times New Roman" w:cs="Times New Roman"/>
@@ -3836,18 +3473,8 @@
           <w:sz w:val="20"/>
           <w:szCs w:val="20"/>
         </w:rPr>
-        <w:t>.</w:t>
-      </w:r>
-      <w:proofErr w:type="spellStart"/>
-      <w:r>
-        <w:rPr>
-          <w:rFonts w:ascii="Courier New" w:eastAsia="Times New Roman" w:hAnsi="Courier New" w:cs="Courier New"/>
-          <w:sz w:val="20"/>
-          <w:szCs w:val="20"/>
-        </w:rPr>
-        <w:t>csproj</w:t>
-      </w:r>
-      <w:proofErr w:type="spellEnd"/>
+        <w:t>.csproj</w:t>
+      </w:r>
       <w:r>
         <w:rPr>
           <w:rFonts w:ascii="Times New Roman" w:eastAsia="Times New Roman" w:hAnsi="Times New Roman" w:cs="Times New Roman"/>
@@ -3884,18 +3511,8 @@
           <w:sz w:val="20"/>
           <w:szCs w:val="20"/>
         </w:rPr>
-        <w:t>Properties/</w:t>
-      </w:r>
-      <w:proofErr w:type="spellStart"/>
-      <w:r>
-        <w:rPr>
-          <w:rFonts w:ascii="Courier New" w:eastAsia="Times New Roman" w:hAnsi="Courier New" w:cs="Courier New"/>
-          <w:sz w:val="20"/>
-          <w:szCs w:val="20"/>
-        </w:rPr>
-        <w:t>launchSettings.json</w:t>
-      </w:r>
-      <w:proofErr w:type="spellEnd"/>
+        <w:t>Properties/launchSettings.json</w:t>
+      </w:r>
       <w:r>
         <w:rPr>
           <w:rFonts w:ascii="Times New Roman" w:eastAsia="Times New Roman" w:hAnsi="Times New Roman" w:cs="Times New Roman"/>
@@ -3924,16 +3541,7 @@
           <w:sz w:val="24"/>
           <w:szCs w:val="24"/>
         </w:rPr>
-        <w:t xml:space="preserve">Look </w:t>
-      </w:r>
-      <w:proofErr w:type="gramStart"/>
-      <w:r>
-        <w:rPr>
-          <w:rFonts w:ascii="Times New Roman" w:eastAsia="Times New Roman" w:hAnsi="Times New Roman" w:cs="Times New Roman"/>
-          <w:sz w:val="24"/>
-          <w:szCs w:val="24"/>
-        </w:rPr>
-        <w:t xml:space="preserve">for </w:t>
+        <w:t xml:space="preserve">Look for </w:t>
       </w:r>
       <w:r>
         <w:rPr>
@@ -3941,27 +3549,8 @@
           <w:sz w:val="20"/>
           <w:szCs w:val="20"/>
         </w:rPr>
-        <w:t>.</w:t>
-      </w:r>
-      <w:proofErr w:type="spellStart"/>
-      <w:r>
-        <w:rPr>
-          <w:rFonts w:ascii="Courier New" w:eastAsia="Times New Roman" w:hAnsi="Courier New" w:cs="Courier New"/>
-          <w:sz w:val="20"/>
-          <w:szCs w:val="20"/>
-        </w:rPr>
-        <w:t>env</w:t>
-      </w:r>
-      <w:proofErr w:type="gramEnd"/>
-      <w:r>
-        <w:rPr>
-          <w:rFonts w:ascii="Courier New" w:eastAsia="Times New Roman" w:hAnsi="Courier New" w:cs="Courier New"/>
-          <w:sz w:val="20"/>
-          <w:szCs w:val="20"/>
-        </w:rPr>
-        <w:t>.example</w:t>
-      </w:r>
-      <w:proofErr w:type="spellEnd"/>
+        <w:t>.env.example</w:t>
+      </w:r>
       <w:r>
         <w:rPr>
           <w:rFonts w:ascii="Times New Roman" w:eastAsia="Times New Roman" w:hAnsi="Times New Roman" w:cs="Times New Roman"/>
@@ -4025,23 +3614,13 @@
           <w:szCs w:val="24"/>
         </w:rPr>
       </w:pPr>
-      <w:proofErr w:type="spellStart"/>
-      <w:r>
-        <w:rPr>
-          <w:rFonts w:ascii="Times New Roman" w:eastAsia="Times New Roman" w:hAnsi="Times New Roman" w:cs="Times New Roman"/>
-          <w:sz w:val="24"/>
-          <w:szCs w:val="24"/>
-        </w:rPr>
-        <w:t>TripMate's</w:t>
-      </w:r>
-      <w:proofErr w:type="spellEnd"/>
-      <w:r>
-        <w:rPr>
-          <w:rFonts w:ascii="Times New Roman" w:eastAsia="Times New Roman" w:hAnsi="Times New Roman" w:cs="Times New Roman"/>
-          <w:sz w:val="24"/>
-          <w:szCs w:val="24"/>
-        </w:rPr>
-        <w:t xml:space="preserve"> backend must be able to connect to its database if the application depends on MySQL for destinations, user accounts or bookings.</w:t>
+      <w:r>
+        <w:rPr>
+          <w:rFonts w:ascii="Times New Roman" w:eastAsia="Times New Roman" w:hAnsi="Times New Roman" w:cs="Times New Roman"/>
+          <w:sz w:val="24"/>
+          <w:szCs w:val="24"/>
+        </w:rPr>
+        <w:t>TripMate's backend must be able to connect to its database if the application depends on MySQL for destinations, user accounts or bookings.</w:t>
       </w:r>
     </w:p>
     <w:p>
@@ -4352,117 +3931,25 @@
           <w:sz w:val="20"/>
           <w:szCs w:val="20"/>
         </w:rPr>
-        <w:t>Server=</w:t>
-      </w:r>
-      <w:proofErr w:type="spellStart"/>
-      <w:proofErr w:type="gramStart"/>
-      <w:r>
-        <w:rPr>
-          <w:rFonts w:ascii="Courier New" w:eastAsia="Times New Roman" w:hAnsi="Courier New" w:cs="Courier New"/>
-          <w:sz w:val="20"/>
-          <w:szCs w:val="20"/>
-        </w:rPr>
-        <w:t>localhost;Port</w:t>
-      </w:r>
-      <w:proofErr w:type="spellEnd"/>
-      <w:proofErr w:type="gramEnd"/>
-      <w:r>
-        <w:rPr>
-          <w:rFonts w:ascii="Courier New" w:eastAsia="Times New Roman" w:hAnsi="Courier New" w:cs="Courier New"/>
-          <w:sz w:val="20"/>
-          <w:szCs w:val="20"/>
-        </w:rPr>
-        <w:t>=3306;Database=</w:t>
-      </w:r>
-      <w:proofErr w:type="spellStart"/>
-      <w:r>
-        <w:rPr>
-          <w:rFonts w:ascii="Courier New" w:eastAsia="Times New Roman" w:hAnsi="Courier New" w:cs="Courier New"/>
-          <w:sz w:val="20"/>
-          <w:szCs w:val="20"/>
-        </w:rPr>
-        <w:t>TripMate;User</w:t>
-      </w:r>
-      <w:proofErr w:type="spellEnd"/>
-      <w:r>
-        <w:rPr>
-          <w:rFonts w:ascii="Courier New" w:eastAsia="Times New Roman" w:hAnsi="Courier New" w:cs="Courier New"/>
-          <w:sz w:val="20"/>
-          <w:szCs w:val="20"/>
-        </w:rPr>
-        <w:t xml:space="preserve"> ID=</w:t>
-      </w:r>
-      <w:proofErr w:type="spellStart"/>
-      <w:r>
-        <w:rPr>
-          <w:rFonts w:ascii="Courier New" w:eastAsia="Times New Roman" w:hAnsi="Courier New" w:cs="Courier New"/>
-          <w:sz w:val="20"/>
-          <w:szCs w:val="20"/>
-        </w:rPr>
-        <w:t>your_username;Password</w:t>
-      </w:r>
-      <w:proofErr w:type="spellEnd"/>
-      <w:r>
-        <w:rPr>
-          <w:rFonts w:ascii="Courier New" w:eastAsia="Times New Roman" w:hAnsi="Courier New" w:cs="Courier New"/>
-          <w:sz w:val="20"/>
-          <w:szCs w:val="20"/>
-        </w:rPr>
-        <w:t>=</w:t>
-      </w:r>
-      <w:proofErr w:type="spellStart"/>
-      <w:r>
-        <w:rPr>
-          <w:rFonts w:ascii="Courier New" w:eastAsia="Times New Roman" w:hAnsi="Courier New" w:cs="Courier New"/>
-          <w:sz w:val="20"/>
-          <w:szCs w:val="20"/>
-        </w:rPr>
-        <w:t>your_password</w:t>
-      </w:r>
-      <w:proofErr w:type="spellEnd"/>
-      <w:r>
-        <w:rPr>
-          <w:rFonts w:ascii="Courier New" w:eastAsia="Times New Roman" w:hAnsi="Courier New" w:cs="Courier New"/>
-          <w:sz w:val="20"/>
-          <w:szCs w:val="20"/>
-        </w:rPr>
-        <w:t>;</w:t>
-      </w:r>
-    </w:p>
-    <w:p>
-      <w:pPr>
-        <w:spacing w:before="100" w:beforeAutospacing="1" w:after="100" w:afterAutospacing="1" w:line="240" w:lineRule="auto"/>
-        <w:rPr>
-          <w:rFonts w:ascii="Times New Roman" w:eastAsia="Times New Roman" w:hAnsi="Times New Roman" w:cs="Times New Roman"/>
-          <w:sz w:val="24"/>
-          <w:szCs w:val="24"/>
-        </w:rPr>
-      </w:pPr>
-      <w:r>
-        <w:rPr>
-          <w:rFonts w:ascii="Times New Roman" w:eastAsia="Times New Roman" w:hAnsi="Times New Roman" w:cs="Times New Roman"/>
-          <w:sz w:val="24"/>
-          <w:szCs w:val="24"/>
-        </w:rPr>
-        <w:t xml:space="preserve">This is an illustrative example only. Use the actual database name, configuration key, database provider and credentials required by </w:t>
-      </w:r>
-      <w:proofErr w:type="spellStart"/>
-      <w:r>
-        <w:rPr>
-          <w:rFonts w:ascii="Times New Roman" w:eastAsia="Times New Roman" w:hAnsi="Times New Roman" w:cs="Times New Roman"/>
-          <w:sz w:val="24"/>
-          <w:szCs w:val="24"/>
-        </w:rPr>
-        <w:t>TripMate</w:t>
-      </w:r>
-      <w:proofErr w:type="spellEnd"/>
-      <w:r>
-        <w:rPr>
-          <w:rFonts w:ascii="Times New Roman" w:eastAsia="Times New Roman" w:hAnsi="Times New Roman" w:cs="Times New Roman"/>
-          <w:sz w:val="24"/>
-          <w:szCs w:val="24"/>
-        </w:rPr>
-        <w:t>.</w:t>
+        <w:t>Server=localhost;Port=3306;Database=TripMate;User ID=your_username;Password=your_password;</w:t>
+      </w:r>
+    </w:p>
+    <w:p>
+      <w:pPr>
+        <w:spacing w:before="100" w:beforeAutospacing="1" w:after="100" w:afterAutospacing="1" w:line="240" w:lineRule="auto"/>
+        <w:rPr>
+          <w:rFonts w:ascii="Times New Roman" w:eastAsia="Times New Roman" w:hAnsi="Times New Roman" w:cs="Times New Roman"/>
+          <w:sz w:val="24"/>
+          <w:szCs w:val="24"/>
+        </w:rPr>
+      </w:pPr>
+      <w:r>
+        <w:rPr>
+          <w:rFonts w:ascii="Times New Roman" w:eastAsia="Times New Roman" w:hAnsi="Times New Roman" w:cs="Times New Roman"/>
+          <w:sz w:val="24"/>
+          <w:szCs w:val="24"/>
+        </w:rPr>
+        <w:t>This is an illustrative example only. Use the actual database name, configuration key, database provider and credentials required by TripMate.</w:t>
       </w:r>
     </w:p>
     <w:p>
@@ -4564,8 +4051,6 @@
         </w:rPr>
         <w:t xml:space="preserve">Find the folder containing </w:t>
       </w:r>
-      <w:proofErr w:type="spellStart"/>
-      <w:proofErr w:type="gramStart"/>
       <w:r>
         <w:rPr>
           <w:rFonts w:ascii="Courier New" w:eastAsia="Times New Roman" w:hAnsi="Courier New" w:cs="Courier New"/>
@@ -4574,8 +4059,6 @@
         </w:rPr>
         <w:t>package.json</w:t>
       </w:r>
-      <w:proofErr w:type="spellEnd"/>
-      <w:proofErr w:type="gramEnd"/>
       <w:r>
         <w:rPr>
           <w:rFonts w:ascii="Times New Roman" w:eastAsia="Times New Roman" w:hAnsi="Times New Roman" w:cs="Times New Roman"/>
@@ -4782,23 +4265,13 @@
           <w:szCs w:val="20"/>
         </w:rPr>
       </w:pPr>
-      <w:proofErr w:type="spellStart"/>
       <w:r>
         <w:rPr>
           <w:rFonts w:ascii="Courier New" w:eastAsia="Times New Roman" w:hAnsi="Courier New" w:cs="Courier New"/>
           <w:sz w:val="20"/>
           <w:szCs w:val="20"/>
         </w:rPr>
-        <w:t>npm</w:t>
-      </w:r>
-      <w:proofErr w:type="spellEnd"/>
-      <w:r>
-        <w:rPr>
-          <w:rFonts w:ascii="Courier New" w:eastAsia="Times New Roman" w:hAnsi="Courier New" w:cs="Courier New"/>
-          <w:sz w:val="20"/>
-          <w:szCs w:val="20"/>
-        </w:rPr>
-        <w:t xml:space="preserve"> install</w:t>
+        <w:t>npm install</w:t>
       </w:r>
     </w:p>
     <w:p>
@@ -4835,25 +4308,7 @@
           <w:szCs w:val="24"/>
         </w:rPr>
         <w:lastRenderedPageBreak/>
-        <w:t xml:space="preserve">If the project uses a specific package manager or </w:t>
-      </w:r>
-      <w:proofErr w:type="spellStart"/>
-      <w:r>
-        <w:rPr>
-          <w:rFonts w:ascii="Times New Roman" w:eastAsia="Times New Roman" w:hAnsi="Times New Roman" w:cs="Times New Roman"/>
-          <w:sz w:val="24"/>
-          <w:szCs w:val="24"/>
-        </w:rPr>
-        <w:t>lockfile</w:t>
-      </w:r>
-      <w:proofErr w:type="spellEnd"/>
-      <w:r>
-        <w:rPr>
-          <w:rFonts w:ascii="Times New Roman" w:eastAsia="Times New Roman" w:hAnsi="Times New Roman" w:cs="Times New Roman"/>
-          <w:sz w:val="24"/>
-          <w:szCs w:val="24"/>
-        </w:rPr>
-        <w:t>, follow the repository instructions instead.</w:t>
+        <w:t>If the project uses a specific package manager or lockfile, follow the repository instructions instead.</w:t>
       </w:r>
     </w:p>
     <w:p>
@@ -4896,8 +4351,6 @@
         </w:rPr>
         <w:t xml:space="preserve">Open </w:t>
       </w:r>
-      <w:proofErr w:type="spellStart"/>
-      <w:proofErr w:type="gramStart"/>
       <w:r>
         <w:rPr>
           <w:rFonts w:ascii="Courier New" w:eastAsia="Times New Roman" w:hAnsi="Courier New" w:cs="Courier New"/>
@@ -4906,8 +4359,6 @@
         </w:rPr>
         <w:t>package.json</w:t>
       </w:r>
-      <w:proofErr w:type="spellEnd"/>
-      <w:proofErr w:type="gramEnd"/>
       <w:r>
         <w:rPr>
           <w:rFonts w:ascii="Times New Roman" w:eastAsia="Times New Roman" w:hAnsi="Times New Roman" w:cs="Times New Roman"/>
@@ -5038,25 +4489,7 @@
           <w:sz w:val="20"/>
           <w:szCs w:val="20"/>
         </w:rPr>
-        <w:t xml:space="preserve">    "dev": "</w:t>
-      </w:r>
-      <w:proofErr w:type="spellStart"/>
-      <w:r>
-        <w:rPr>
-          <w:rFonts w:ascii="Courier New" w:eastAsia="Times New Roman" w:hAnsi="Courier New" w:cs="Courier New"/>
-          <w:sz w:val="20"/>
-          <w:szCs w:val="20"/>
-        </w:rPr>
-        <w:t>vite</w:t>
-      </w:r>
-      <w:proofErr w:type="spellEnd"/>
-      <w:r>
-        <w:rPr>
-          <w:rFonts w:ascii="Courier New" w:eastAsia="Times New Roman" w:hAnsi="Courier New" w:cs="Courier New"/>
-          <w:sz w:val="20"/>
-          <w:szCs w:val="20"/>
-        </w:rPr>
-        <w:t>",</w:t>
+        <w:t xml:space="preserve">    "dev": "vite",</w:t>
       </w:r>
     </w:p>
     <w:p>
@@ -5092,25 +4525,7 @@
           <w:sz w:val="20"/>
           <w:szCs w:val="20"/>
         </w:rPr>
-        <w:t xml:space="preserve">    "build": "</w:t>
-      </w:r>
-      <w:proofErr w:type="spellStart"/>
-      <w:r>
-        <w:rPr>
-          <w:rFonts w:ascii="Courier New" w:eastAsia="Times New Roman" w:hAnsi="Courier New" w:cs="Courier New"/>
-          <w:sz w:val="20"/>
-          <w:szCs w:val="20"/>
-        </w:rPr>
-        <w:t>vite</w:t>
-      </w:r>
-      <w:proofErr w:type="spellEnd"/>
-      <w:r>
-        <w:rPr>
-          <w:rFonts w:ascii="Courier New" w:eastAsia="Times New Roman" w:hAnsi="Courier New" w:cs="Courier New"/>
-          <w:sz w:val="20"/>
-          <w:szCs w:val="20"/>
-        </w:rPr>
-        <w:t xml:space="preserve"> build"</w:t>
+        <w:t xml:space="preserve">    "build": "vite build"</w:t>
       </w:r>
     </w:p>
     <w:p>
@@ -5200,25 +4615,7 @@
           <w:sz w:val="24"/>
           <w:szCs w:val="24"/>
         </w:rPr>
-        <w:t xml:space="preserve">The above is an example, not a verified copy of </w:t>
-      </w:r>
-      <w:proofErr w:type="spellStart"/>
-      <w:r>
-        <w:rPr>
-          <w:rFonts w:ascii="Times New Roman" w:eastAsia="Times New Roman" w:hAnsi="Times New Roman" w:cs="Times New Roman"/>
-          <w:sz w:val="24"/>
-          <w:szCs w:val="24"/>
-        </w:rPr>
-        <w:t>TripMate's</w:t>
-      </w:r>
-      <w:proofErr w:type="spellEnd"/>
-      <w:r>
-        <w:rPr>
-          <w:rFonts w:ascii="Times New Roman" w:eastAsia="Times New Roman" w:hAnsi="Times New Roman" w:cs="Times New Roman"/>
-          <w:sz w:val="24"/>
-          <w:szCs w:val="24"/>
-        </w:rPr>
-        <w:t xml:space="preserve"> configuration.</w:t>
+        <w:t>The above is an example, not a verified copy of TripMate's configuration.</w:t>
       </w:r>
     </w:p>
     <w:p>
@@ -5282,23 +4679,13 @@
           <w:szCs w:val="20"/>
         </w:rPr>
       </w:pPr>
-      <w:proofErr w:type="spellStart"/>
       <w:r>
         <w:rPr>
           <w:rFonts w:ascii="Courier New" w:eastAsia="Times New Roman" w:hAnsi="Courier New" w:cs="Courier New"/>
           <w:sz w:val="20"/>
           <w:szCs w:val="20"/>
         </w:rPr>
-        <w:t>npm</w:t>
-      </w:r>
-      <w:proofErr w:type="spellEnd"/>
-      <w:r>
-        <w:rPr>
-          <w:rFonts w:ascii="Courier New" w:eastAsia="Times New Roman" w:hAnsi="Courier New" w:cs="Courier New"/>
-          <w:sz w:val="20"/>
-          <w:szCs w:val="20"/>
-        </w:rPr>
-        <w:t xml:space="preserve"> run dev</w:t>
+        <w:t>npm run dev</w:t>
       </w:r>
     </w:p>
     <w:p>
@@ -5362,54 +4749,40 @@
           <w:szCs w:val="20"/>
         </w:rPr>
       </w:pPr>
-      <w:proofErr w:type="spellStart"/>
       <w:r>
         <w:rPr>
           <w:rFonts w:ascii="Courier New" w:eastAsia="Times New Roman" w:hAnsi="Courier New" w:cs="Courier New"/>
           <w:sz w:val="20"/>
           <w:szCs w:val="20"/>
         </w:rPr>
-        <w:t>npm</w:t>
-      </w:r>
-      <w:proofErr w:type="spellEnd"/>
+        <w:t>npm start</w:t>
+      </w:r>
+    </w:p>
+    <w:p>
+      <w:pPr>
+        <w:spacing w:before="100" w:beforeAutospacing="1" w:after="100" w:afterAutospacing="1" w:line="240" w:lineRule="auto"/>
+        <w:rPr>
+          <w:rFonts w:ascii="Times New Roman" w:eastAsia="Times New Roman" w:hAnsi="Times New Roman" w:cs="Times New Roman"/>
+          <w:sz w:val="24"/>
+          <w:szCs w:val="24"/>
+        </w:rPr>
+      </w:pPr>
+      <w:r>
+        <w:rPr>
+          <w:rFonts w:ascii="Times New Roman" w:eastAsia="Times New Roman" w:hAnsi="Times New Roman" w:cs="Times New Roman"/>
+          <w:sz w:val="24"/>
+          <w:szCs w:val="24"/>
+        </w:rPr>
+        <w:t xml:space="preserve">Use the command that is actually defined in your project's </w:t>
+      </w:r>
       <w:r>
         <w:rPr>
           <w:rFonts w:ascii="Courier New" w:eastAsia="Times New Roman" w:hAnsi="Courier New" w:cs="Courier New"/>
           <w:sz w:val="20"/>
           <w:szCs w:val="20"/>
         </w:rPr>
-        <w:t xml:space="preserve"> start</w:t>
-      </w:r>
-    </w:p>
-    <w:p>
-      <w:pPr>
-        <w:spacing w:before="100" w:beforeAutospacing="1" w:after="100" w:afterAutospacing="1" w:line="240" w:lineRule="auto"/>
-        <w:rPr>
-          <w:rFonts w:ascii="Times New Roman" w:eastAsia="Times New Roman" w:hAnsi="Times New Roman" w:cs="Times New Roman"/>
-          <w:sz w:val="24"/>
-          <w:szCs w:val="24"/>
-        </w:rPr>
-      </w:pPr>
-      <w:r>
-        <w:rPr>
-          <w:rFonts w:ascii="Times New Roman" w:eastAsia="Times New Roman" w:hAnsi="Times New Roman" w:cs="Times New Roman"/>
-          <w:sz w:val="24"/>
-          <w:szCs w:val="24"/>
-        </w:rPr>
-        <w:t xml:space="preserve">Use the command that is actually defined in your project's </w:t>
-      </w:r>
-      <w:proofErr w:type="spellStart"/>
-      <w:proofErr w:type="gramStart"/>
-      <w:r>
-        <w:rPr>
-          <w:rFonts w:ascii="Courier New" w:eastAsia="Times New Roman" w:hAnsi="Courier New" w:cs="Courier New"/>
-          <w:sz w:val="20"/>
-          <w:szCs w:val="20"/>
-        </w:rPr>
         <w:t>package.json</w:t>
       </w:r>
-      <w:proofErr w:type="spellEnd"/>
-      <w:proofErr w:type="gramEnd"/>
       <w:r>
         <w:rPr>
           <w:rFonts w:ascii="Times New Roman" w:eastAsia="Times New Roman" w:hAnsi="Times New Roman" w:cs="Times New Roman"/>
@@ -5667,25 +5040,7 @@
           <w:sz w:val="24"/>
           <w:szCs w:val="24"/>
         </w:rPr>
-        <w:t xml:space="preserve">These are common examples, not confirmed </w:t>
-      </w:r>
-      <w:proofErr w:type="spellStart"/>
-      <w:r>
-        <w:rPr>
-          <w:rFonts w:ascii="Times New Roman" w:eastAsia="Times New Roman" w:hAnsi="Times New Roman" w:cs="Times New Roman"/>
-          <w:sz w:val="24"/>
-          <w:szCs w:val="24"/>
-        </w:rPr>
-        <w:t>TripMate</w:t>
-      </w:r>
-      <w:proofErr w:type="spellEnd"/>
-      <w:r>
-        <w:rPr>
-          <w:rFonts w:ascii="Times New Roman" w:eastAsia="Times New Roman" w:hAnsi="Times New Roman" w:cs="Times New Roman"/>
-          <w:sz w:val="24"/>
-          <w:szCs w:val="24"/>
-        </w:rPr>
-        <w:t xml:space="preserve"> addresses. Use the exact URL printed in your terminal.</w:t>
+        <w:t>These are common examples, not confirmed TripMate addresses. Use the exact URL printed in your terminal.</w:t>
       </w:r>
     </w:p>
     <w:p>
@@ -5745,25 +5100,7 @@
           <w:sz w:val="24"/>
           <w:szCs w:val="24"/>
         </w:rPr>
-        <w:t xml:space="preserve">The backend processes </w:t>
-      </w:r>
-      <w:proofErr w:type="gramStart"/>
-      <w:r>
-        <w:rPr>
-          <w:rFonts w:ascii="Times New Roman" w:eastAsia="Times New Roman" w:hAnsi="Times New Roman" w:cs="Times New Roman"/>
-          <w:sz w:val="24"/>
-          <w:szCs w:val="24"/>
-        </w:rPr>
-        <w:t>requests</w:t>
-      </w:r>
-      <w:proofErr w:type="gramEnd"/>
-      <w:r>
-        <w:rPr>
-          <w:rFonts w:ascii="Times New Roman" w:eastAsia="Times New Roman" w:hAnsi="Times New Roman" w:cs="Times New Roman"/>
-          <w:sz w:val="24"/>
-          <w:szCs w:val="24"/>
-        </w:rPr>
-        <w:t xml:space="preserve"> from the frontend and handles application logic and database communication.</w:t>
+        <w:t>The backend processes requests from the frontend and handles application logic and database communication.</w:t>
       </w:r>
     </w:p>
     <w:p>
@@ -5871,18 +5208,8 @@
           <w:sz w:val="20"/>
           <w:szCs w:val="20"/>
         </w:rPr>
-        <w:t>.</w:t>
-      </w:r>
-      <w:proofErr w:type="spellStart"/>
-      <w:r>
-        <w:rPr>
-          <w:rFonts w:ascii="Courier New" w:eastAsia="Times New Roman" w:hAnsi="Courier New" w:cs="Courier New"/>
-          <w:sz w:val="20"/>
-          <w:szCs w:val="20"/>
-        </w:rPr>
-        <w:t>csproj</w:t>
-      </w:r>
-      <w:proofErr w:type="spellEnd"/>
+        <w:t>.csproj</w:t>
+      </w:r>
       <w:r>
         <w:rPr>
           <w:rFonts w:ascii="Times New Roman" w:eastAsia="Times New Roman" w:hAnsi="Times New Roman" w:cs="Times New Roman"/>
@@ -6032,23 +5359,13 @@
           <w:szCs w:val="20"/>
         </w:rPr>
       </w:pPr>
-      <w:proofErr w:type="spellStart"/>
       <w:r>
         <w:rPr>
           <w:rFonts w:ascii="Courier New" w:eastAsia="Times New Roman" w:hAnsi="Courier New" w:cs="Courier New"/>
           <w:sz w:val="20"/>
           <w:szCs w:val="20"/>
         </w:rPr>
-        <w:t>dotnet</w:t>
-      </w:r>
-      <w:proofErr w:type="spellEnd"/>
-      <w:r>
-        <w:rPr>
-          <w:rFonts w:ascii="Courier New" w:eastAsia="Times New Roman" w:hAnsi="Courier New" w:cs="Courier New"/>
-          <w:sz w:val="20"/>
-          <w:szCs w:val="20"/>
-        </w:rPr>
-        <w:t xml:space="preserve"> restore</w:t>
+        <w:t>dotnet restore</w:t>
       </w:r>
     </w:p>
     <w:p>
@@ -6137,23 +5454,13 @@
           <w:szCs w:val="20"/>
         </w:rPr>
       </w:pPr>
-      <w:proofErr w:type="spellStart"/>
       <w:r>
         <w:rPr>
           <w:rFonts w:ascii="Courier New" w:eastAsia="Times New Roman" w:hAnsi="Courier New" w:cs="Courier New"/>
           <w:sz w:val="20"/>
           <w:szCs w:val="20"/>
         </w:rPr>
-        <w:t>dotnet</w:t>
-      </w:r>
-      <w:proofErr w:type="spellEnd"/>
-      <w:r>
-        <w:rPr>
-          <w:rFonts w:ascii="Courier New" w:eastAsia="Times New Roman" w:hAnsi="Courier New" w:cs="Courier New"/>
-          <w:sz w:val="20"/>
-          <w:szCs w:val="20"/>
-        </w:rPr>
-        <w:t xml:space="preserve"> build</w:t>
+        <w:t>dotnet build</w:t>
       </w:r>
     </w:p>
     <w:p>
@@ -6242,23 +5549,13 @@
           <w:szCs w:val="20"/>
         </w:rPr>
       </w:pPr>
-      <w:proofErr w:type="spellStart"/>
       <w:r>
         <w:rPr>
           <w:rFonts w:ascii="Courier New" w:eastAsia="Times New Roman" w:hAnsi="Courier New" w:cs="Courier New"/>
           <w:sz w:val="20"/>
           <w:szCs w:val="20"/>
         </w:rPr>
-        <w:t>dotnet</w:t>
-      </w:r>
-      <w:proofErr w:type="spellEnd"/>
-      <w:r>
-        <w:rPr>
-          <w:rFonts w:ascii="Courier New" w:eastAsia="Times New Roman" w:hAnsi="Courier New" w:cs="Courier New"/>
-          <w:sz w:val="20"/>
-          <w:szCs w:val="20"/>
-        </w:rPr>
-        <w:t xml:space="preserve"> run</w:t>
+        <w:t>dotnet run</w:t>
       </w:r>
     </w:p>
     <w:p>
@@ -6427,70 +5724,40 @@
           <w:szCs w:val="20"/>
         </w:rPr>
       </w:pPr>
-      <w:proofErr w:type="spellStart"/>
       <w:r>
         <w:rPr>
           <w:rFonts w:ascii="Courier New" w:eastAsia="Times New Roman" w:hAnsi="Courier New" w:cs="Courier New"/>
           <w:sz w:val="20"/>
           <w:szCs w:val="20"/>
         </w:rPr>
-        <w:t>dotnet</w:t>
-      </w:r>
-      <w:proofErr w:type="spellEnd"/>
+        <w:t>dotnet run --project "YourApiProject.csproj"</w:t>
+      </w:r>
+    </w:p>
+    <w:p>
+      <w:pPr>
+        <w:spacing w:before="100" w:beforeAutospacing="1" w:after="100" w:afterAutospacing="1" w:line="240" w:lineRule="auto"/>
+        <w:rPr>
+          <w:rFonts w:ascii="Times New Roman" w:eastAsia="Times New Roman" w:hAnsi="Times New Roman" w:cs="Times New Roman"/>
+          <w:sz w:val="24"/>
+          <w:szCs w:val="24"/>
+        </w:rPr>
+      </w:pPr>
+      <w:r>
+        <w:rPr>
+          <w:rFonts w:ascii="Times New Roman" w:eastAsia="Times New Roman" w:hAnsi="Times New Roman" w:cs="Times New Roman"/>
+          <w:sz w:val="24"/>
+          <w:szCs w:val="24"/>
+        </w:rPr>
+        <w:t xml:space="preserve">Replace </w:t>
+      </w:r>
       <w:r>
         <w:rPr>
           <w:rFonts w:ascii="Courier New" w:eastAsia="Times New Roman" w:hAnsi="Courier New" w:cs="Courier New"/>
           <w:sz w:val="20"/>
           <w:szCs w:val="20"/>
         </w:rPr>
-        <w:t xml:space="preserve"> run --project "</w:t>
-      </w:r>
-      <w:proofErr w:type="spellStart"/>
-      <w:r>
-        <w:rPr>
-          <w:rFonts w:ascii="Courier New" w:eastAsia="Times New Roman" w:hAnsi="Courier New" w:cs="Courier New"/>
-          <w:sz w:val="20"/>
-          <w:szCs w:val="20"/>
-        </w:rPr>
         <w:t>YourApiProject.csproj</w:t>
       </w:r>
-      <w:proofErr w:type="spellEnd"/>
-      <w:r>
-        <w:rPr>
-          <w:rFonts w:ascii="Courier New" w:eastAsia="Times New Roman" w:hAnsi="Courier New" w:cs="Courier New"/>
-          <w:sz w:val="20"/>
-          <w:szCs w:val="20"/>
-        </w:rPr>
-        <w:t>"</w:t>
-      </w:r>
-    </w:p>
-    <w:p>
-      <w:pPr>
-        <w:spacing w:before="100" w:beforeAutospacing="1" w:after="100" w:afterAutospacing="1" w:line="240" w:lineRule="auto"/>
-        <w:rPr>
-          <w:rFonts w:ascii="Times New Roman" w:eastAsia="Times New Roman" w:hAnsi="Times New Roman" w:cs="Times New Roman"/>
-          <w:sz w:val="24"/>
-          <w:szCs w:val="24"/>
-        </w:rPr>
-      </w:pPr>
-      <w:r>
-        <w:rPr>
-          <w:rFonts w:ascii="Times New Roman" w:eastAsia="Times New Roman" w:hAnsi="Times New Roman" w:cs="Times New Roman"/>
-          <w:sz w:val="24"/>
-          <w:szCs w:val="24"/>
-        </w:rPr>
-        <w:t xml:space="preserve">Replace </w:t>
-      </w:r>
-      <w:proofErr w:type="spellStart"/>
-      <w:r>
-        <w:rPr>
-          <w:rFonts w:ascii="Courier New" w:eastAsia="Times New Roman" w:hAnsi="Courier New" w:cs="Courier New"/>
-          <w:sz w:val="20"/>
-          <w:szCs w:val="20"/>
-        </w:rPr>
-        <w:t>YourApiProject.csproj</w:t>
-      </w:r>
-      <w:proofErr w:type="spellEnd"/>
       <w:r>
         <w:rPr>
           <w:rFonts w:ascii="Times New Roman" w:eastAsia="Times New Roman" w:hAnsi="Times New Roman" w:cs="Times New Roman"/>
@@ -6618,18 +5885,8 @@
           <w:sz w:val="20"/>
           <w:szCs w:val="20"/>
         </w:rPr>
-        <w:t>Properties/</w:t>
-      </w:r>
-      <w:proofErr w:type="spellStart"/>
-      <w:r>
-        <w:rPr>
-          <w:rFonts w:ascii="Courier New" w:eastAsia="Times New Roman" w:hAnsi="Courier New" w:cs="Courier New"/>
-          <w:sz w:val="20"/>
-          <w:szCs w:val="20"/>
-        </w:rPr>
-        <w:t>launchSettings.json</w:t>
-      </w:r>
-      <w:proofErr w:type="spellEnd"/>
+        <w:t>Properties/launchSettings.json</w:t>
+      </w:r>
       <w:r>
         <w:rPr>
           <w:rFonts w:ascii="Times New Roman" w:eastAsia="Times New Roman" w:hAnsi="Times New Roman" w:cs="Times New Roman"/>
@@ -6659,29 +5916,7 @@
           <w:sz w:val="36"/>
           <w:szCs w:val="36"/>
         </w:rPr>
-        <w:t xml:space="preserve">10. Opening the </w:t>
-      </w:r>
-      <w:proofErr w:type="spellStart"/>
-      <w:r>
-        <w:rPr>
-          <w:rFonts w:ascii="Times New Roman" w:eastAsia="Times New Roman" w:hAnsi="Times New Roman" w:cs="Times New Roman"/>
-          <w:b/>
-          <w:bCs/>
-          <w:sz w:val="36"/>
-          <w:szCs w:val="36"/>
-        </w:rPr>
-        <w:t>TripMate</w:t>
-      </w:r>
-      <w:proofErr w:type="spellEnd"/>
-      <w:r>
-        <w:rPr>
-          <w:rFonts w:ascii="Times New Roman" w:eastAsia="Times New Roman" w:hAnsi="Times New Roman" w:cs="Times New Roman"/>
-          <w:b/>
-          <w:bCs/>
-          <w:sz w:val="36"/>
-          <w:szCs w:val="36"/>
-        </w:rPr>
-        <w:t xml:space="preserve"> web application</w:t>
+        <w:t>10. Opening the TripMate web application</w:t>
       </w:r>
     </w:p>
     <w:p>
@@ -6773,23 +6008,13 @@
         </w:rPr>
         <w:t xml:space="preserve">Run </w:t>
       </w:r>
-      <w:proofErr w:type="spellStart"/>
       <w:r>
         <w:rPr>
           <w:rFonts w:ascii="Courier New" w:eastAsia="Times New Roman" w:hAnsi="Courier New" w:cs="Courier New"/>
           <w:sz w:val="20"/>
           <w:szCs w:val="20"/>
         </w:rPr>
-        <w:t>dotnet</w:t>
-      </w:r>
-      <w:proofErr w:type="spellEnd"/>
-      <w:r>
-        <w:rPr>
-          <w:rFonts w:ascii="Courier New" w:eastAsia="Times New Roman" w:hAnsi="Courier New" w:cs="Courier New"/>
-          <w:sz w:val="20"/>
-          <w:szCs w:val="20"/>
-        </w:rPr>
-        <w:t xml:space="preserve"> run</w:t>
+        <w:t>dotnet run</w:t>
       </w:r>
       <w:r>
         <w:rPr>
@@ -6833,25 +6058,7 @@
           <w:sz w:val="24"/>
           <w:szCs w:val="24"/>
         </w:rPr>
-        <w:t xml:space="preserve">Run the appropriate </w:t>
-      </w:r>
-      <w:proofErr w:type="spellStart"/>
-      <w:r>
-        <w:rPr>
-          <w:rFonts w:ascii="Times New Roman" w:eastAsia="Times New Roman" w:hAnsi="Times New Roman" w:cs="Times New Roman"/>
-          <w:sz w:val="24"/>
-          <w:szCs w:val="24"/>
-        </w:rPr>
-        <w:t>npm</w:t>
-      </w:r>
-      <w:proofErr w:type="spellEnd"/>
-      <w:r>
-        <w:rPr>
-          <w:rFonts w:ascii="Times New Roman" w:eastAsia="Times New Roman" w:hAnsi="Times New Roman" w:cs="Times New Roman"/>
-          <w:sz w:val="24"/>
-          <w:szCs w:val="24"/>
-        </w:rPr>
-        <w:t xml:space="preserve"> script in the frontend folder and keep the terminal open.</w:t>
+        <w:t>Run the appropriate npm script in the frontend folder and keep the terminal open.</w:t>
       </w:r>
     </w:p>
     <w:p>
@@ -7390,25 +6597,7 @@
                 <w:sz w:val="24"/>
                 <w:szCs w:val="24"/>
               </w:rPr>
-              <w:t xml:space="preserve">An </w:t>
-            </w:r>
-            <w:proofErr w:type="spellStart"/>
-            <w:r>
-              <w:rPr>
-                <w:rFonts w:ascii="Times New Roman" w:eastAsia="Times New Roman" w:hAnsi="Times New Roman" w:cs="Times New Roman"/>
-                <w:sz w:val="24"/>
-                <w:szCs w:val="24"/>
-              </w:rPr>
-              <w:t>authorised</w:t>
-            </w:r>
-            <w:proofErr w:type="spellEnd"/>
-            <w:r>
-              <w:rPr>
-                <w:rFonts w:ascii="Times New Roman" w:eastAsia="Times New Roman" w:hAnsi="Times New Roman" w:cs="Times New Roman"/>
-                <w:sz w:val="24"/>
-                <w:szCs w:val="24"/>
-              </w:rPr>
-              <w:t xml:space="preserve"> registered user can complete the supported booking flow</w:t>
+              <w:t>An authorised registered user can complete the supported booking flow</w:t>
             </w:r>
           </w:p>
         </w:tc>
@@ -7512,23 +6701,13 @@
                 <w:szCs w:val="24"/>
               </w:rPr>
             </w:pPr>
-            <w:proofErr w:type="spellStart"/>
             <w:r>
               <w:rPr>
                 <w:rFonts w:ascii="Times New Roman" w:eastAsia="Times New Roman" w:hAnsi="Times New Roman" w:cs="Times New Roman"/>
                 <w:sz w:val="24"/>
                 <w:szCs w:val="24"/>
               </w:rPr>
-              <w:t>Authorised</w:t>
-            </w:r>
-            <w:proofErr w:type="spellEnd"/>
-            <w:r>
-              <w:rPr>
-                <w:rFonts w:ascii="Times New Roman" w:eastAsia="Times New Roman" w:hAnsi="Times New Roman" w:cs="Times New Roman"/>
-                <w:sz w:val="24"/>
-                <w:szCs w:val="24"/>
-              </w:rPr>
-              <w:t xml:space="preserve"> admin can manage the supported destination records</w:t>
+              <w:t>Authorised admin can manage the supported destination records</w:t>
             </w:r>
           </w:p>
         </w:tc>
@@ -7659,25 +6838,7 @@
           <w:sz w:val="24"/>
           <w:szCs w:val="24"/>
         </w:rPr>
-        <w:t xml:space="preserve">The expected results above describe the intended checks based on </w:t>
-      </w:r>
-      <w:proofErr w:type="spellStart"/>
-      <w:r>
-        <w:rPr>
-          <w:rFonts w:ascii="Times New Roman" w:eastAsia="Times New Roman" w:hAnsi="Times New Roman" w:cs="Times New Roman"/>
-          <w:sz w:val="24"/>
-          <w:szCs w:val="24"/>
-        </w:rPr>
-        <w:t>TripMate's</w:t>
-      </w:r>
-      <w:proofErr w:type="spellEnd"/>
-      <w:r>
-        <w:rPr>
-          <w:rFonts w:ascii="Times New Roman" w:eastAsia="Times New Roman" w:hAnsi="Times New Roman" w:cs="Times New Roman"/>
-          <w:sz w:val="24"/>
-          <w:szCs w:val="24"/>
-        </w:rPr>
-        <w:t xml:space="preserve"> described functionality. Actual results must be verified by executing the application.</w:t>
+        <w:t>The expected results above describe the intended checks based on TripMate's described functionality. Actual results must be verified by executing the application.</w:t>
       </w:r>
     </w:p>
     <w:p>
@@ -7844,25 +7005,7 @@
           <w:sz w:val="24"/>
           <w:szCs w:val="24"/>
         </w:rPr>
-        <w:t xml:space="preserve">Test suitable endpoints using </w:t>
-      </w:r>
-      <w:proofErr w:type="spellStart"/>
-      <w:r>
-        <w:rPr>
-          <w:rFonts w:ascii="Times New Roman" w:eastAsia="Times New Roman" w:hAnsi="Times New Roman" w:cs="Times New Roman"/>
-          <w:sz w:val="24"/>
-          <w:szCs w:val="24"/>
-        </w:rPr>
-        <w:t>authorised</w:t>
-      </w:r>
-      <w:proofErr w:type="spellEnd"/>
-      <w:r>
-        <w:rPr>
-          <w:rFonts w:ascii="Times New Roman" w:eastAsia="Times New Roman" w:hAnsi="Times New Roman" w:cs="Times New Roman"/>
-          <w:sz w:val="24"/>
-          <w:szCs w:val="24"/>
-        </w:rPr>
-        <w:t xml:space="preserve"> test data.</w:t>
+        <w:t>Test suitable endpoints using authorised test data.</w:t>
       </w:r>
     </w:p>
     <w:p>
@@ -8028,7 +7171,6 @@
                 <w:szCs w:val="24"/>
               </w:rPr>
             </w:pPr>
-            <w:proofErr w:type="spellStart"/>
             <w:r>
               <w:rPr>
                 <w:rFonts w:ascii="Courier New" w:eastAsia="Times New Roman" w:hAnsi="Courier New" w:cs="Courier New"/>
@@ -8037,25 +7179,14 @@
               </w:rPr>
               <w:t>git</w:t>
             </w:r>
-            <w:proofErr w:type="spellEnd"/>
             <w:r>
               <w:rPr>
                 <w:rFonts w:ascii="Times New Roman" w:eastAsia="Times New Roman" w:hAnsi="Times New Roman" w:cs="Times New Roman"/>
                 <w:sz w:val="24"/>
                 <w:szCs w:val="24"/>
               </w:rPr>
-              <w:t xml:space="preserve"> is not </w:t>
+              <w:t xml:space="preserve"> is not recognised</w:t>
             </w:r>
-            <w:proofErr w:type="spellStart"/>
-            <w:r>
-              <w:rPr>
-                <w:rFonts w:ascii="Times New Roman" w:eastAsia="Times New Roman" w:hAnsi="Times New Roman" w:cs="Times New Roman"/>
-                <w:sz w:val="24"/>
-                <w:szCs w:val="24"/>
-              </w:rPr>
-              <w:t>recognised</w:t>
-            </w:r>
-            <w:proofErr w:type="spellEnd"/>
           </w:p>
         </w:tc>
         <w:tc>
@@ -8103,7 +7234,6 @@
                 <w:szCs w:val="24"/>
               </w:rPr>
             </w:pPr>
-            <w:proofErr w:type="spellStart"/>
             <w:r>
               <w:rPr>
                 <w:rFonts w:ascii="Courier New" w:eastAsia="Times New Roman" w:hAnsi="Courier New" w:cs="Courier New"/>
@@ -8113,25 +7243,14 @@
               <w:lastRenderedPageBreak/>
               <w:t>npm</w:t>
             </w:r>
-            <w:proofErr w:type="spellEnd"/>
             <w:r>
               <w:rPr>
                 <w:rFonts w:ascii="Times New Roman" w:eastAsia="Times New Roman" w:hAnsi="Times New Roman" w:cs="Times New Roman"/>
                 <w:sz w:val="24"/>
                 <w:szCs w:val="24"/>
               </w:rPr>
-              <w:t xml:space="preserve"> is not </w:t>
+              <w:t xml:space="preserve"> is not recognised</w:t>
             </w:r>
-            <w:proofErr w:type="spellStart"/>
-            <w:r>
-              <w:rPr>
-                <w:rFonts w:ascii="Times New Roman" w:eastAsia="Times New Roman" w:hAnsi="Times New Roman" w:cs="Times New Roman"/>
-                <w:sz w:val="24"/>
-                <w:szCs w:val="24"/>
-              </w:rPr>
-              <w:t>recognised</w:t>
-            </w:r>
-            <w:proofErr w:type="spellEnd"/>
           </w:p>
         </w:tc>
         <w:tc>
@@ -8179,7 +7298,6 @@
                 <w:szCs w:val="24"/>
               </w:rPr>
             </w:pPr>
-            <w:proofErr w:type="spellStart"/>
             <w:r>
               <w:rPr>
                 <w:rFonts w:ascii="Courier New" w:eastAsia="Times New Roman" w:hAnsi="Courier New" w:cs="Courier New"/>
@@ -8188,25 +7306,14 @@
               </w:rPr>
               <w:t>dotnet</w:t>
             </w:r>
-            <w:proofErr w:type="spellEnd"/>
             <w:r>
               <w:rPr>
                 <w:rFonts w:ascii="Times New Roman" w:eastAsia="Times New Roman" w:hAnsi="Times New Roman" w:cs="Times New Roman"/>
                 <w:sz w:val="24"/>
                 <w:szCs w:val="24"/>
               </w:rPr>
-              <w:t xml:space="preserve"> is not </w:t>
+              <w:t xml:space="preserve"> is not recognised</w:t>
             </w:r>
-            <w:proofErr w:type="spellStart"/>
-            <w:r>
-              <w:rPr>
-                <w:rFonts w:ascii="Times New Roman" w:eastAsia="Times New Roman" w:hAnsi="Times New Roman" w:cs="Times New Roman"/>
-                <w:sz w:val="24"/>
-                <w:szCs w:val="24"/>
-              </w:rPr>
-              <w:t>recognised</w:t>
-            </w:r>
-            <w:proofErr w:type="spellEnd"/>
           </w:p>
         </w:tc>
         <w:tc>
@@ -8254,23 +7361,13 @@
                 <w:szCs w:val="24"/>
               </w:rPr>
             </w:pPr>
-            <w:proofErr w:type="spellStart"/>
             <w:r>
               <w:rPr>
                 <w:rFonts w:ascii="Courier New" w:eastAsia="Times New Roman" w:hAnsi="Courier New" w:cs="Courier New"/>
                 <w:sz w:val="20"/>
                 <w:szCs w:val="20"/>
               </w:rPr>
-              <w:t>npm</w:t>
-            </w:r>
-            <w:proofErr w:type="spellEnd"/>
-            <w:r>
-              <w:rPr>
-                <w:rFonts w:ascii="Courier New" w:eastAsia="Times New Roman" w:hAnsi="Courier New" w:cs="Courier New"/>
-                <w:sz w:val="20"/>
-                <w:szCs w:val="20"/>
-              </w:rPr>
-              <w:t xml:space="preserve"> install</w:t>
+              <w:t>npm install</w:t>
             </w:r>
             <w:r>
               <w:rPr>
@@ -8327,23 +7424,13 @@
                 <w:szCs w:val="24"/>
               </w:rPr>
             </w:pPr>
-            <w:proofErr w:type="spellStart"/>
             <w:r>
               <w:rPr>
                 <w:rFonts w:ascii="Courier New" w:eastAsia="Times New Roman" w:hAnsi="Courier New" w:cs="Courier New"/>
                 <w:sz w:val="20"/>
                 <w:szCs w:val="20"/>
               </w:rPr>
-              <w:t>dotnet</w:t>
-            </w:r>
-            <w:proofErr w:type="spellEnd"/>
-            <w:r>
-              <w:rPr>
-                <w:rFonts w:ascii="Courier New" w:eastAsia="Times New Roman" w:hAnsi="Courier New" w:cs="Courier New"/>
-                <w:sz w:val="20"/>
-                <w:szCs w:val="20"/>
-              </w:rPr>
-              <w:t xml:space="preserve"> build</w:t>
+              <w:t>dotnet build</w:t>
             </w:r>
             <w:r>
               <w:rPr>
@@ -8732,20 +7819,8 @@
           <w:sz w:val="27"/>
           <w:szCs w:val="27"/>
         </w:rPr>
-        <w:t xml:space="preserve">How to inspect browser </w:t>
-      </w:r>
-      <w:proofErr w:type="gramStart"/>
-      <w:r>
-        <w:rPr>
-          <w:rFonts w:ascii="Times New Roman" w:eastAsia="Times New Roman" w:hAnsi="Times New Roman" w:cs="Times New Roman"/>
-          <w:b/>
-          <w:bCs/>
-          <w:sz w:val="27"/>
-          <w:szCs w:val="27"/>
-        </w:rPr>
-        <w:t>errors</w:t>
-      </w:r>
-      <w:proofErr w:type="gramEnd"/>
+        <w:t>How to inspect browser errors</w:t>
+      </w:r>
     </w:p>
     <w:p>
       <w:pPr>
@@ -8766,25 +7841,7 @@
           <w:sz w:val="24"/>
           <w:szCs w:val="24"/>
         </w:rPr>
-        <w:t xml:space="preserve">Open the </w:t>
-      </w:r>
-      <w:proofErr w:type="spellStart"/>
-      <w:r>
-        <w:rPr>
-          <w:rFonts w:ascii="Times New Roman" w:eastAsia="Times New Roman" w:hAnsi="Times New Roman" w:cs="Times New Roman"/>
-          <w:sz w:val="24"/>
-          <w:szCs w:val="24"/>
-        </w:rPr>
-        <w:t>TripMate</w:t>
-      </w:r>
-      <w:proofErr w:type="spellEnd"/>
-      <w:r>
-        <w:rPr>
-          <w:rFonts w:ascii="Times New Roman" w:eastAsia="Times New Roman" w:hAnsi="Times New Roman" w:cs="Times New Roman"/>
-          <w:sz w:val="24"/>
-          <w:szCs w:val="24"/>
-        </w:rPr>
-        <w:t xml:space="preserve"> website.</w:t>
+        <w:t>Open the TripMate website.</w:t>
       </w:r>
     </w:p>
     <w:p>
@@ -9000,10 +8057,10 @@
             <v:path o:extrusionok="f" gradientshapeok="t" o:connecttype="rect"/>
             <o:lock v:ext="edit" aspectratio="t"/>
           </v:shapetype>
-          <v:shape id="_x0000_i1042" type="#_x0000_t75" style="width:16.5pt;height:15pt" o:ole="">
+          <v:shape id="_x0000_i1055" type="#_x0000_t75" style="width:16.5pt;height:15pt" o:ole="">
             <v:imagedata r:id="rId22" o:title=""/>
           </v:shape>
-          <w:control r:id="rId23" w:name="DefaultOcxName" w:shapeid="_x0000_i1042"/>
+          <w:control r:id="rId23" w:name="DefaultOcxName" w:shapeid="_x0000_i1055"/>
         </w:object>
       </w:r>
       <w:r>
@@ -9035,10 +8092,10 @@
           <w:szCs w:val="24"/>
         </w:rPr>
         <w:object w:dxaOrig="225" w:dyaOrig="225">
-          <v:shape id="_x0000_i1041" type="#_x0000_t75" style="width:16.5pt;height:15pt" o:ole="">
+          <v:shape id="_x0000_i1056" type="#_x0000_t75" style="width:16.5pt;height:15pt" o:ole="">
             <v:imagedata r:id="rId22" o:title=""/>
           </v:shape>
-          <w:control r:id="rId24" w:name="DefaultOcxName1" w:shapeid="_x0000_i1041"/>
+          <w:control r:id="rId24" w:name="DefaultOcxName1" w:shapeid="_x0000_i1056"/>
         </w:object>
       </w:r>
       <w:r>
@@ -9047,25 +8104,7 @@
           <w:sz w:val="24"/>
           <w:szCs w:val="24"/>
         </w:rPr>
-        <w:t xml:space="preserve">Open the </w:t>
-      </w:r>
-      <w:proofErr w:type="spellStart"/>
-      <w:r>
-        <w:rPr>
-          <w:rFonts w:ascii="Times New Roman" w:eastAsia="Times New Roman" w:hAnsi="Times New Roman" w:cs="Times New Roman"/>
-          <w:sz w:val="24"/>
-          <w:szCs w:val="24"/>
-        </w:rPr>
-        <w:t>TripMate</w:t>
-      </w:r>
-      <w:proofErr w:type="spellEnd"/>
-      <w:r>
-        <w:rPr>
-          <w:rFonts w:ascii="Times New Roman" w:eastAsia="Times New Roman" w:hAnsi="Times New Roman" w:cs="Times New Roman"/>
-          <w:sz w:val="24"/>
-          <w:szCs w:val="24"/>
-        </w:rPr>
-        <w:t xml:space="preserve"> repository in VS Code.</w:t>
+        <w:t>Open the TripMate repository in VS Code.</w:t>
       </w:r>
     </w:p>
     <w:p>
@@ -9088,10 +8127,10 @@
           <w:szCs w:val="24"/>
         </w:rPr>
         <w:object w:dxaOrig="225" w:dyaOrig="225">
-          <v:shape id="_x0000_i1040" type="#_x0000_t75" style="width:16.5pt;height:15pt" o:ole="">
+          <v:shape id="_x0000_i1057" type="#_x0000_t75" style="width:16.5pt;height:15pt" o:ole="">
             <v:imagedata r:id="rId22" o:title=""/>
           </v:shape>
-          <w:control r:id="rId25" w:name="DefaultOcxName2" w:shapeid="_x0000_i1040"/>
+          <w:control r:id="rId25" w:name="DefaultOcxName2" w:shapeid="_x0000_i1057"/>
         </w:object>
       </w:r>
       <w:r>
@@ -9123,10 +8162,10 @@
           <w:szCs w:val="24"/>
         </w:rPr>
         <w:object w:dxaOrig="225" w:dyaOrig="225">
-          <v:shape id="_x0000_i1039" type="#_x0000_t75" style="width:16.5pt;height:15pt" o:ole="">
+          <v:shape id="_x0000_i1058" type="#_x0000_t75" style="width:16.5pt;height:15pt" o:ole="">
             <v:imagedata r:id="rId22" o:title=""/>
           </v:shape>
-          <w:control r:id="rId26" w:name="DefaultOcxName3" w:shapeid="_x0000_i1039"/>
+          <w:control r:id="rId26" w:name="DefaultOcxName3" w:shapeid="_x0000_i1058"/>
         </w:object>
       </w:r>
       <w:r>
@@ -9135,27 +8174,10 @@
           <w:sz w:val="24"/>
           <w:szCs w:val="24"/>
         </w:rPr>
-        <w:t xml:space="preserve">Start the frontend using the correct </w:t>
-      </w:r>
-      <w:proofErr w:type="spellStart"/>
-      <w:r>
-        <w:rPr>
-          <w:rFonts w:ascii="Times New Roman" w:eastAsia="Times New Roman" w:hAnsi="Times New Roman" w:cs="Times New Roman"/>
-          <w:sz w:val="24"/>
-          <w:szCs w:val="24"/>
-        </w:rPr>
-        <w:t>npm</w:t>
-      </w:r>
-      <w:proofErr w:type="spellEnd"/>
-      <w:r>
-        <w:rPr>
-          <w:rFonts w:ascii="Times New Roman" w:eastAsia="Times New Roman" w:hAnsi="Times New Roman" w:cs="Times New Roman"/>
-          <w:sz w:val="24"/>
-          <w:szCs w:val="24"/>
-        </w:rPr>
-        <w:t xml:space="preserve"> script.</w:t>
-      </w:r>
-    </w:p>
+        <w:t>Start the frontend using the correct npm script.</w:t>
+      </w:r>
+    </w:p>
+    <w:bookmarkStart w:id="0" w:name="_GoBack"/>
     <w:p>
       <w:pPr>
         <w:numPr>
@@ -9176,12 +8198,13 @@
           <w:szCs w:val="24"/>
         </w:rPr>
         <w:object w:dxaOrig="225" w:dyaOrig="225">
-          <v:shape id="_x0000_i1038" type="#_x0000_t75" style="width:16.5pt;height:15pt" o:ole="">
+          <v:shape id="_x0000_i1061" type="#_x0000_t75" style="width:16.5pt;height:15pt" o:ole="">
             <v:imagedata r:id="rId22" o:title=""/>
           </v:shape>
-          <w:control r:id="rId27" w:name="DefaultOcxName4" w:shapeid="_x0000_i1038"/>
+          <w:control r:id="rId27" w:name="DefaultOcxName4" w:shapeid="_x0000_i1061"/>
         </w:object>
       </w:r>
+      <w:bookmarkEnd w:id="0"/>
       <w:r>
         <w:rPr>
           <w:rFonts w:ascii="Times New Roman" w:eastAsia="Times New Roman" w:hAnsi="Times New Roman" w:cs="Times New Roman"/>
@@ -9211,10 +8234,10 @@
           <w:szCs w:val="24"/>
         </w:rPr>
         <w:object w:dxaOrig="225" w:dyaOrig="225">
-          <v:shape id="_x0000_i1037" type="#_x0000_t75" style="width:16.5pt;height:15pt" o:ole="">
+          <v:shape id="_x0000_i1060" type="#_x0000_t75" style="width:16.5pt;height:15pt" o:ole="">
             <v:imagedata r:id="rId22" o:title=""/>
           </v:shape>
-          <w:control r:id="rId28" w:name="DefaultOcxName5" w:shapeid="_x0000_i1037"/>
+          <w:control r:id="rId28" w:name="DefaultOcxName5" w:shapeid="_x0000_i1060"/>
         </w:object>
       </w:r>
       <w:r>
@@ -9540,23 +8563,13 @@
                 <w:szCs w:val="24"/>
               </w:rPr>
             </w:pPr>
-            <w:proofErr w:type="spellStart"/>
             <w:r>
               <w:rPr>
                 <w:rFonts w:ascii="Courier New" w:eastAsia="Times New Roman" w:hAnsi="Courier New" w:cs="Courier New"/>
                 <w:sz w:val="20"/>
                 <w:szCs w:val="20"/>
               </w:rPr>
-              <w:t>git</w:t>
-            </w:r>
-            <w:proofErr w:type="spellEnd"/>
-            <w:r>
-              <w:rPr>
-                <w:rFonts w:ascii="Courier New" w:eastAsia="Times New Roman" w:hAnsi="Courier New" w:cs="Courier New"/>
-                <w:sz w:val="20"/>
-                <w:szCs w:val="20"/>
-              </w:rPr>
-              <w:t xml:space="preserve"> --version</w:t>
+              <w:t>git --version</w:t>
             </w:r>
           </w:p>
         </w:tc>
@@ -9641,18 +8654,8 @@
                 <w:sz w:val="24"/>
                 <w:szCs w:val="24"/>
               </w:rPr>
-              <w:t xml:space="preserve">Check </w:t>
+              <w:t>Check npm</w:t>
             </w:r>
-            <w:proofErr w:type="spellStart"/>
-            <w:r>
-              <w:rPr>
-                <w:rFonts w:ascii="Times New Roman" w:eastAsia="Times New Roman" w:hAnsi="Times New Roman" w:cs="Times New Roman"/>
-                <w:sz w:val="24"/>
-                <w:szCs w:val="24"/>
-              </w:rPr>
-              <w:t>npm</w:t>
-            </w:r>
-            <w:proofErr w:type="spellEnd"/>
           </w:p>
         </w:tc>
         <w:tc>
@@ -9670,23 +8673,13 @@
                 <w:szCs w:val="24"/>
               </w:rPr>
             </w:pPr>
-            <w:proofErr w:type="spellStart"/>
             <w:r>
               <w:rPr>
                 <w:rFonts w:ascii="Courier New" w:eastAsia="Times New Roman" w:hAnsi="Courier New" w:cs="Courier New"/>
                 <w:sz w:val="20"/>
                 <w:szCs w:val="20"/>
               </w:rPr>
-              <w:t>npm</w:t>
-            </w:r>
-            <w:proofErr w:type="spellEnd"/>
-            <w:r>
-              <w:rPr>
-                <w:rFonts w:ascii="Courier New" w:eastAsia="Times New Roman" w:hAnsi="Courier New" w:cs="Courier New"/>
-                <w:sz w:val="20"/>
-                <w:szCs w:val="20"/>
-              </w:rPr>
-              <w:t xml:space="preserve"> --version</w:t>
+              <w:t>npm --version</w:t>
             </w:r>
           </w:p>
         </w:tc>
@@ -9735,23 +8728,13 @@
                 <w:szCs w:val="24"/>
               </w:rPr>
             </w:pPr>
-            <w:proofErr w:type="spellStart"/>
             <w:r>
               <w:rPr>
                 <w:rFonts w:ascii="Courier New" w:eastAsia="Times New Roman" w:hAnsi="Courier New" w:cs="Courier New"/>
                 <w:sz w:val="20"/>
                 <w:szCs w:val="20"/>
               </w:rPr>
-              <w:t>dotnet</w:t>
-            </w:r>
-            <w:proofErr w:type="spellEnd"/>
-            <w:r>
-              <w:rPr>
-                <w:rFonts w:ascii="Courier New" w:eastAsia="Times New Roman" w:hAnsi="Courier New" w:cs="Courier New"/>
-                <w:sz w:val="20"/>
-                <w:szCs w:val="20"/>
-              </w:rPr>
-              <w:t xml:space="preserve"> --info</w:t>
+              <w:t>dotnet --info</w:t>
             </w:r>
           </w:p>
         </w:tc>
@@ -9800,41 +8783,13 @@
                 <w:szCs w:val="24"/>
               </w:rPr>
             </w:pPr>
-            <w:proofErr w:type="spellStart"/>
             <w:r>
               <w:rPr>
                 <w:rFonts w:ascii="Courier New" w:eastAsia="Times New Roman" w:hAnsi="Courier New" w:cs="Courier New"/>
                 <w:sz w:val="20"/>
                 <w:szCs w:val="20"/>
               </w:rPr>
-              <w:t>git</w:t>
-            </w:r>
-            <w:proofErr w:type="spellEnd"/>
-            <w:r>
-              <w:rPr>
-                <w:rFonts w:ascii="Courier New" w:eastAsia="Times New Roman" w:hAnsi="Courier New" w:cs="Courier New"/>
-                <w:sz w:val="20"/>
-                <w:szCs w:val="20"/>
-              </w:rPr>
-              <w:t xml:space="preserve"> clone &lt;repository-</w:t>
-            </w:r>
-            <w:proofErr w:type="spellStart"/>
-            <w:r>
-              <w:rPr>
-                <w:rFonts w:ascii="Courier New" w:eastAsia="Times New Roman" w:hAnsi="Courier New" w:cs="Courier New"/>
-                <w:sz w:val="20"/>
-                <w:szCs w:val="20"/>
-              </w:rPr>
-              <w:t>url</w:t>
-            </w:r>
-            <w:proofErr w:type="spellEnd"/>
-            <w:r>
-              <w:rPr>
-                <w:rFonts w:ascii="Courier New" w:eastAsia="Times New Roman" w:hAnsi="Courier New" w:cs="Courier New"/>
-                <w:sz w:val="20"/>
-                <w:szCs w:val="20"/>
-              </w:rPr>
-              <w:t>&gt;</w:t>
+              <w:t>git clone &lt;repository-url&gt;</w:t>
             </w:r>
           </w:p>
         </w:tc>
@@ -9883,23 +8838,13 @@
                 <w:szCs w:val="24"/>
               </w:rPr>
             </w:pPr>
-            <w:proofErr w:type="spellStart"/>
             <w:r>
               <w:rPr>
                 <w:rFonts w:ascii="Courier New" w:eastAsia="Times New Roman" w:hAnsi="Courier New" w:cs="Courier New"/>
                 <w:sz w:val="20"/>
                 <w:szCs w:val="20"/>
               </w:rPr>
-              <w:t>npm</w:t>
-            </w:r>
-            <w:proofErr w:type="spellEnd"/>
-            <w:r>
-              <w:rPr>
-                <w:rFonts w:ascii="Courier New" w:eastAsia="Times New Roman" w:hAnsi="Courier New" w:cs="Courier New"/>
-                <w:sz w:val="20"/>
-                <w:szCs w:val="20"/>
-              </w:rPr>
-              <w:t xml:space="preserve"> install</w:t>
+              <w:t>npm install</w:t>
             </w:r>
           </w:p>
         </w:tc>
@@ -9948,23 +8893,13 @@
                 <w:szCs w:val="24"/>
               </w:rPr>
             </w:pPr>
-            <w:proofErr w:type="spellStart"/>
             <w:r>
               <w:rPr>
                 <w:rFonts w:ascii="Courier New" w:eastAsia="Times New Roman" w:hAnsi="Courier New" w:cs="Courier New"/>
                 <w:sz w:val="20"/>
                 <w:szCs w:val="20"/>
               </w:rPr>
-              <w:t>npm</w:t>
-            </w:r>
-            <w:proofErr w:type="spellEnd"/>
-            <w:r>
-              <w:rPr>
-                <w:rFonts w:ascii="Courier New" w:eastAsia="Times New Roman" w:hAnsi="Courier New" w:cs="Courier New"/>
-                <w:sz w:val="20"/>
-                <w:szCs w:val="20"/>
-              </w:rPr>
-              <w:t xml:space="preserve"> run dev</w:t>
+              <w:t>npm run dev</w:t>
             </w:r>
             <w:r>
               <w:rPr>
@@ -10021,23 +8956,13 @@
                 <w:szCs w:val="24"/>
               </w:rPr>
             </w:pPr>
-            <w:proofErr w:type="spellStart"/>
             <w:r>
               <w:rPr>
                 <w:rFonts w:ascii="Courier New" w:eastAsia="Times New Roman" w:hAnsi="Courier New" w:cs="Courier New"/>
                 <w:sz w:val="20"/>
                 <w:szCs w:val="20"/>
               </w:rPr>
-              <w:t>dotnet</w:t>
-            </w:r>
-            <w:proofErr w:type="spellEnd"/>
-            <w:r>
-              <w:rPr>
-                <w:rFonts w:ascii="Courier New" w:eastAsia="Times New Roman" w:hAnsi="Courier New" w:cs="Courier New"/>
-                <w:sz w:val="20"/>
-                <w:szCs w:val="20"/>
-              </w:rPr>
-              <w:t xml:space="preserve"> restore</w:t>
+              <w:t>dotnet restore</w:t>
             </w:r>
           </w:p>
         </w:tc>
@@ -10086,23 +9011,13 @@
                 <w:szCs w:val="24"/>
               </w:rPr>
             </w:pPr>
-            <w:proofErr w:type="spellStart"/>
             <w:r>
               <w:rPr>
                 <w:rFonts w:ascii="Courier New" w:eastAsia="Times New Roman" w:hAnsi="Courier New" w:cs="Courier New"/>
                 <w:sz w:val="20"/>
                 <w:szCs w:val="20"/>
               </w:rPr>
-              <w:t>dotnet</w:t>
-            </w:r>
-            <w:proofErr w:type="spellEnd"/>
-            <w:r>
-              <w:rPr>
-                <w:rFonts w:ascii="Courier New" w:eastAsia="Times New Roman" w:hAnsi="Courier New" w:cs="Courier New"/>
-                <w:sz w:val="20"/>
-                <w:szCs w:val="20"/>
-              </w:rPr>
-              <w:t xml:space="preserve"> build</w:t>
+              <w:t>dotnet build</w:t>
             </w:r>
           </w:p>
         </w:tc>
@@ -10151,23 +9066,13 @@
                 <w:szCs w:val="24"/>
               </w:rPr>
             </w:pPr>
-            <w:proofErr w:type="spellStart"/>
             <w:r>
               <w:rPr>
                 <w:rFonts w:ascii="Courier New" w:eastAsia="Times New Roman" w:hAnsi="Courier New" w:cs="Courier New"/>
                 <w:sz w:val="20"/>
                 <w:szCs w:val="20"/>
               </w:rPr>
-              <w:t>dotnet</w:t>
-            </w:r>
-            <w:proofErr w:type="spellEnd"/>
-            <w:r>
-              <w:rPr>
-                <w:rFonts w:ascii="Courier New" w:eastAsia="Times New Roman" w:hAnsi="Courier New" w:cs="Courier New"/>
-                <w:sz w:val="20"/>
-                <w:szCs w:val="20"/>
-              </w:rPr>
-              <w:t xml:space="preserve"> run</w:t>
+              <w:t>dotnet run</w:t>
             </w:r>
           </w:p>
         </w:tc>
@@ -10264,23 +9169,13 @@
           <w:szCs w:val="24"/>
         </w:rPr>
       </w:pPr>
-      <w:proofErr w:type="spellStart"/>
-      <w:r>
-        <w:rPr>
-          <w:rFonts w:ascii="Times New Roman" w:eastAsia="Times New Roman" w:hAnsi="Times New Roman" w:cs="Times New Roman"/>
-          <w:sz w:val="24"/>
-          <w:szCs w:val="24"/>
-        </w:rPr>
-        <w:t>TripMate</w:t>
-      </w:r>
-      <w:proofErr w:type="spellEnd"/>
-      <w:r>
-        <w:rPr>
-          <w:rFonts w:ascii="Times New Roman" w:eastAsia="Times New Roman" w:hAnsi="Times New Roman" w:cs="Times New Roman"/>
-          <w:sz w:val="24"/>
-          <w:szCs w:val="24"/>
-        </w:rPr>
-        <w:t xml:space="preserve"> source code: </w:t>
+      <w:r>
+        <w:rPr>
+          <w:rFonts w:ascii="Times New Roman" w:eastAsia="Times New Roman" w:hAnsi="Times New Roman" w:cs="Times New Roman"/>
+          <w:sz w:val="24"/>
+          <w:szCs w:val="24"/>
+        </w:rPr>
+        <w:t xml:space="preserve">TripMate source code: </w:t>
       </w:r>
       <w:hyperlink r:id="rId29" w:history="1">
         <w:r>
@@ -10413,7 +9308,6 @@
         </w:rPr>
       </w:pPr>
       <w:hyperlink r:id="rId34" w:history="1">
-        <w:proofErr w:type="spellStart"/>
         <w:r>
           <w:rPr>
             <w:rFonts w:ascii="Times New Roman" w:eastAsia="Times New Roman" w:hAnsi="Times New Roman" w:cs="Times New Roman"/>
@@ -10422,18 +9316,7 @@
             <w:szCs w:val="24"/>
             <w:u w:val="single"/>
           </w:rPr>
-          <w:t>Vite</w:t>
-        </w:r>
-        <w:proofErr w:type="spellEnd"/>
-        <w:r>
-          <w:rPr>
-            <w:rFonts w:ascii="Times New Roman" w:eastAsia="Times New Roman" w:hAnsi="Times New Roman" w:cs="Times New Roman"/>
-            <w:color w:val="0000FF"/>
-            <w:sz w:val="24"/>
-            <w:szCs w:val="24"/>
-            <w:u w:val="single"/>
-          </w:rPr>
-          <w:t xml:space="preserve"> documentation</w:t>
+          <w:t>Vite documentation</w:t>
         </w:r>
       </w:hyperlink>
     </w:p>
@@ -10487,7 +9370,6 @@
           </w:rPr>
           <w:t xml:space="preserve">.NET </w:t>
         </w:r>
-        <w:proofErr w:type="spellStart"/>
         <w:r>
           <w:rPr>
             <w:rFonts w:ascii="Courier New" w:eastAsia="Times New Roman" w:hAnsi="Courier New" w:cs="Courier New"/>
@@ -10496,18 +9378,7 @@
             <w:szCs w:val="20"/>
             <w:u w:val="single"/>
           </w:rPr>
-          <w:t>dotnet</w:t>
-        </w:r>
-        <w:proofErr w:type="spellEnd"/>
-        <w:r>
-          <w:rPr>
-            <w:rFonts w:ascii="Courier New" w:eastAsia="Times New Roman" w:hAnsi="Courier New" w:cs="Courier New"/>
-            <w:color w:val="0000FF"/>
-            <w:sz w:val="20"/>
-            <w:szCs w:val="20"/>
-            <w:u w:val="single"/>
-          </w:rPr>
-          <w:t xml:space="preserve"> run</w:t>
+          <w:t>dotnet run</w:t>
         </w:r>
         <w:r>
           <w:rPr>
@@ -10585,25 +9456,7 @@
           <w:sz w:val="24"/>
           <w:szCs w:val="24"/>
         </w:rPr>
-        <w:t xml:space="preserve">This manual provides the standard development workflow for setting up and running </w:t>
-      </w:r>
-      <w:proofErr w:type="spellStart"/>
-      <w:r>
-        <w:rPr>
-          <w:rFonts w:ascii="Times New Roman" w:eastAsia="Times New Roman" w:hAnsi="Times New Roman" w:cs="Times New Roman"/>
-          <w:sz w:val="24"/>
-          <w:szCs w:val="24"/>
-        </w:rPr>
-        <w:t>TripMate</w:t>
-      </w:r>
-      <w:proofErr w:type="spellEnd"/>
-      <w:r>
-        <w:rPr>
-          <w:rFonts w:ascii="Times New Roman" w:eastAsia="Times New Roman" w:hAnsi="Times New Roman" w:cs="Times New Roman"/>
-          <w:sz w:val="24"/>
-          <w:szCs w:val="24"/>
-        </w:rPr>
-        <w:t xml:space="preserve"> on a Windows computer. By installing the required software, obtaining the source code, configuring the database, starting the backend and frontend, and opening the frontend URL in a browser, a new team member can prepare a local development environment.</w:t>
+        <w:t>This manual provides the standard development workflow for setting up and running TripMate on a Windows computer. By installing the required software, obtaining the source code, configuring the database, starting the backend and frontend, and opening the frontend URL in a browser, a new team member can prepare a local development environment.</w:t>
       </w:r>
     </w:p>
     <w:p/>

</xml_diff>